<commit_message>
Add USGS/IEA and Transformer/GPT-3 citations, renumber references 1-26
Adds two missing citations (USGS Mineral Commodity Summaries 2026, IEA
Global Critical Minerals Outlook 2025) that were previously named inline
without a proper numbered reference, plus foundational LLM citations
(Vaswani et al. 2017, Brown et al. 2020). Renumbers all existing
in-text citations accordingly.
</commit_message>
<xml_diff>
--- a/thesis/Projektarbeit_yutongliu.docx
+++ b/thesis/Projektarbeit_yutongliu.docx
@@ -323,7 +323,7 @@
           <w:noProof/>
         </w:rPr>
         <w:drawing>
-          <wp:anchor distT="0" distB="0" distL="114300" distR="114300" simplePos="0" relativeHeight="251661824" behindDoc="0" locked="0" layoutInCell="1" allowOverlap="1" wp14:anchorId="4A837BDE" wp14:editId="39899AEB">
+          <wp:anchor distT="0" distB="0" distL="114300" distR="114300" simplePos="0" relativeHeight="251661824" behindDoc="0" locked="0" layoutInCell="1" allowOverlap="1" wp14:anchorId="4A837BDE" wp14:editId="240F64A9">
             <wp:simplePos x="0" y="0"/>
             <wp:positionH relativeFrom="column">
               <wp:posOffset>22748</wp:posOffset>
@@ -654,7 +654,6 @@
       <w:pPr>
         <w:pStyle w:val="Titelblatt3"/>
         <w:rPr>
-          <w:rFonts w:hint="eastAsia"/>
           <w:lang w:eastAsia="zh-CN"/>
         </w:rPr>
         <w:sectPr>
@@ -745,6 +744,10 @@
     <w:p>
       <w:pPr>
         <w:spacing w:line="240" w:lineRule="exact"/>
+        <w:rPr>
+          <w:rFonts w:hint="eastAsia"/>
+          <w:lang w:val="en-US" w:eastAsia="zh-CN"/>
+        </w:rPr>
       </w:pPr>
       <w:r>
         <w:t>Die Stellen der Arbeit, die anderen Quellen im Wortlaut oder dem Sinn nach entnommen wurden, sind durch Angaben der Herkunft kenntlich gemacht (siehe Zitationsrichtlinien). Dies gilt auch für Zeichnungen, Skizzen, bildliche Darstellungen sowie für Quellen aus dem Internet.</w:t>
@@ -992,10 +995,9 @@
       <w:pPr>
         <w:spacing w:line="240" w:lineRule="exact"/>
         <w:rPr>
-          <w:rFonts w:hint="eastAsia"/>
           <w:noProof/>
           <w:szCs w:val="22"/>
-          <w:lang w:val="en-US" w:eastAsia="zh-CN"/>
+          <w:lang w:eastAsia="zh-CN"/>
         </w:rPr>
       </w:pPr>
     </w:p>
@@ -1131,7 +1133,14 @@
         <w:t>Der Prototyp kombiniert LLM-gestützte Agenten für Textverständnis, Klassifikation, Berichtsgenerierung und Validierung mit deterministischen Komponenten für Graphtraversierung, Datenabfrage und RiskScore-Berechnung. Als Datenbasis dient die NAATBatt North American Lithium-Ion Battery Supply Chain Database, aus der ein gerichteter Lieferkettengraph abgeleitet wird.</w:t>
       </w:r>
     </w:p>
-    <w:p/>
+    <w:p>
+      <w:pPr>
+        <w:rPr>
+          <w:rFonts w:hint="eastAsia"/>
+          <w:lang w:eastAsia="zh-CN"/>
+        </w:rPr>
+      </w:pPr>
+    </w:p>
     <w:p>
       <w:r>
         <w:t>Die Evaluation anhand von vier Szenarien zeigt stabile Ergebnisse für Merkmalsextraktion, Netzwerkzuordnung und Risikobewertung. Zugleich werden Grenzen sichtbar, insbesondere durch simulierte Lieferbeziehungen und unbelegte Einzelangaben in frei formulierten Berichtspassagen. Die Arbeit zeigt damit, dass LLM-basierte Textinterpretation und deterministische Verarbeitung gemeinsam erklärbare Risikoanalysen unterstützen können, sofern Datenherkunft und Modellannahmen transparent ausgewiesen werden.</w:t>
@@ -5810,14 +5819,13 @@
           <w:noProof/>
           <w:kern w:val="2"/>
           <w:sz w:val="22"/>
-          <w:lang w:val="en-US" w:eastAsia="zh-CN"/>
+          <w:lang w:eastAsia="zh-CN"/>
           <w14:ligatures w14:val="standardContextual"/>
         </w:rPr>
       </w:pPr>
       <w:r>
         <w:rPr>
           <w:noProof/>
-          <w:lang w:val="en-US"/>
         </w:rPr>
         <w:t>Anhang A</w:t>
       </w:r>
@@ -6617,20 +6625,26 @@
         <w:rPr>
           <w:szCs w:val="24"/>
         </w:rPr>
-        <w:t>che Spannungen, Naturkatastrophen, Pandemien und Arbeitskonflikte unterbrechen Warenströme, die sich über zahlreiche Länder und Lieferstufen erstrecken. Für das Jahr 2024 re</w:t>
-      </w:r>
-      <w:r>
-        <w:t>gistriert eine Branchenanalyse einen Anstieg gemeldeter globaler Lieferkettenunterbrechungen um 38 Prozent gegenüber dem Vorjahr, Arbeitskonflikte allein um 47 Prozent [1].</w:t>
-      </w:r>
-    </w:p>
-    <w:p>
-      <w:r>
-        <w:t>Besonders betroffen ist die Batterieindustrie. Kritische Rohstoffe wie Lithium, Kobalt und Nickel werden in wenigen Weltregionen gefördert und über mehrstufige Netzwerke zu Zellen, Modulen und Packs verarbeitet. Diese geografische Konzentration erhöht die Anfälligkeit der Branche: Eine Störung in einer einzelnen Region wirkt sich potenziell auf die gesamte nordamerikanische Batterie-Wertschöpfungskette aus.</w:t>
-      </w:r>
-    </w:p>
-    <w:p>
-      <w:r>
-        <w:t>Kommerzielle Überwachungsplattformen wie Prewave [2] oder Resilinc [1] beobachten Lieferkettenrisiken auf Basis proprietärer Datenquellen und Bewertungsmethoden. Eine systematische, für Nutzende nachvollziehbare Verknüpfung unstrukturierter Ereignistexte mit strukturierten Lieferkettendaten in einem offen dokumentierten Verfahren stellen diese Plattformen nicht bereit. Wissenschaftliche Studien zeigen, dass Ansätze auf Basis von Large Language Models Nachrichtentexte für die Risikoerkennung nutzen [3]. Ein zentrales Problem bleibt dabei ungelöst: Bestehende Ansätze verbinden Nachrichtendaten, Lieferkettenstruktur und Unternehmensdaten nicht systematisch und überlassen sowohl die Interpretation von Ereignistexten als auch die numerische Risikobewertung demselben, unkontrollierten Sprachmodell. Ohne strukturelle Kontrollmechanismen neigen solche Modelle zu Halluzinationen und liefern schwer nachvollziehbare Ergebnisse.</w:t>
+        <w:t xml:space="preserve">che Spannungen, Naturkatastrophen, Pandemien und Arbeitskonflikte unterbrechen Warenströme, die sich über zahlreiche Länder und Lieferstufen erstrecken. </w:t>
+      </w:r>
+      <w:r>
+        <w:rPr>
+          <w:szCs w:val="24"/>
+        </w:rPr>
+        <w:t>Für das Jahr 2025 registriert eine Branchenanalyse einen Anstieg gemeldeter globaler Lieferkettenunterbrechungen um 38 Prozent gegenüber dem Vorjahr; Arbeitskonflikte lösten dabei mit einem Anstieg von 10 Prozent erstmals Fabrikbrände als häufigste Störungsursache ab</w:t>
+      </w:r>
+      <w:r>
+        <w:t xml:space="preserve"> [1].</w:t>
+      </w:r>
+    </w:p>
+    <w:p>
+      <w:r>
+        <w:t>Besonders betroffen ist die Batterieindustrie. Kritische Rohstoffe wie Lithium, Kobalt und Nickel werden in wenigen Weltregionen gefördert und über mehrstufige Netzwerke zu Zellen, Modulen und Packs verarbeitet [2] [3]. Diese geografische Konzentration erhöht die Anfälligkeit der Branche: Eine Störung in einer einzelnen Region wirkt sich potenziell auf die gesamte nordamerikanische Batterie-Wertschöpfungskette aus.</w:t>
+      </w:r>
+    </w:p>
+    <w:p>
+      <w:r>
+        <w:t>Kommerzielle Überwachungsplattformen wie Prewave [4] oder Resilinc [1] beobachten Lieferkettenrisiken auf Basis proprietärer Datenquellen und Bewertungsmethoden. Eine systematische, für Nutzende nachvollziehbare Verknüpfung unstrukturierter Ereignistexte mit strukturierten Lieferkettendaten in einem offen dokumentierten Verfahren stellen diese Plattformen nicht bereit. Wissenschaftliche Studien zeigen, dass Ansätze auf Basis von Large Language Models Nachrichtentexte für die Risikoerkennung nutzen [5]. Ein zentrales Problem bleibt dabei ungelöst: Bestehende Ansätze verbinden Nachrichtendaten, Lieferkettenstruktur und Unternehmensdaten nicht systematisch und überlassen sowohl die Interpretation von Ereignistexten als auch die numerische Risikobewertung demselben, unkontrollierten Sprachmodell. Ohne strukturelle Kontrollmechanismen neigen solche Modelle zu Halluzinationen und liefern schwer nachvollziehbare Ergebnisse.</w:t>
       </w:r>
     </w:p>
     <w:p>
@@ -6745,17 +6759,17 @@
     </w:p>
     <w:p>
       <w:r>
-        <w:t>Globale Lieferketten bestehen aus einer Vielzahl miteinander verbundener Unternehmen, Standorte und Prozesse. Störungen an einzelnen Stellen können sich auf weitere Teile der Lieferkette auswirken. Heckmann, Comes und Nickel zeigen, dass ein großer Teil der bestehenden Literatur Supply Chain Risk ereignisorientiert über das Auftreten einer Störung sowie deren Eintrittswahrscheinlichkeit und Folgen beschreibt. Für eine umfassendere Betrachtung beziehen die Autoren zusätzlich die Eigenschaften der betroffenen Lieferkette und deren Zielgrößen ein [4]. Entscheidend ist damit nicht allein, ob ein Störungsereignis eintritt, sondern welche Veränderungen es innerhalb der Lieferkette auslösen kann und ob dadurch deren Leistungsfähigkeit beeinträchtigt wird. Ein Ereignis (etwa eine Produktionsunterbrechung, eine Naturkatastrophe oder eine regulatorische Einschränkung) stellt zunächst nur einen möglichen Auslöser dar.</w:t>
-      </w:r>
-    </w:p>
-    <w:p>
-      <w:r>
-        <w:t>Die Literatur zeigt zugleich, dass Supply Chain Risks unterschiedliche Ursachen und Ausprägungen besitzen. Ho et al. untersuchen in ihrer Literaturübersicht unter anderem Risikodefinitionen, Risikotypen und Risikofaktoren und zeigen damit die Vielfalt der im Supply Chain Risk Management betrachteten Risiken [5]. Für die vorliegende Arbeit steht dabei nicht die vollständige Klassifikation aller Supply Chain Risks im Vordergrund. Relevant sind vielmehr solche Ereignisse, die anhand verfügbarer Informationen erkannt und anschließend hinsichtlich ihrer möglichen Auswirkungen auf konkrete Lieferkettenstrukturen bewertet werden können.</w:t>
-      </w:r>
-    </w:p>
-    <w:p>
-      <w:r>
-        <w:t>Der systematische Umgang mit solchen Risiken innerhalb von Lieferketten wird in der Literatur als Supply Chain Risk Management bezeichnet. Fan und Stevenson strukturieren das Forschungsfeld anhand von vier Prozessen: Risk Identification, Risk Assessment, Risk Treatment und Risk Monitoring [6].</w:t>
+        <w:t>Globale Lieferketten bestehen aus einer Vielzahl miteinander verbundener Unternehmen, Standorte und Prozesse. Störungen an einzelnen Stellen können sich auf weitere Teile der Lieferkette auswirken. Heckmann, Comes und Nickel zeigen, dass ein großer Teil der bestehenden Literatur Supply Chain Risk ereignisorientiert über das Auftreten einer Störung sowie deren Eintrittswahrscheinlichkeit und Folgen beschreibt. Für eine umfassendere Betrachtung beziehen die Autoren zusätzlich die Eigenschaften der betroffenen Lieferkette und deren Zielgrößen ein [6]. Entscheidend ist damit nicht allein, ob ein Störungsereignis eintritt, sondern welche Veränderungen es innerhalb der Lieferkette auslösen kann und ob dadurch deren Leistungsfähigkeit beeinträchtigt wird. Ein Ereignis (etwa eine Produktionsunterbrechung, eine Naturkatastrophe oder eine regulatorische Einschränkung) stellt zunächst nur einen möglichen Auslöser dar.</w:t>
+      </w:r>
+    </w:p>
+    <w:p>
+      <w:r>
+        <w:t>Die Literatur zeigt zugleich, dass Supply Chain Risks unterschiedliche Ursachen und Ausprägungen besitzen. Ho et al. untersuchen in ihrer Literaturübersicht unter anderem Risikodefinitionen, Risikotypen und Risikofaktoren und zeigen damit die Vielfalt der im Supply Chain Risk Management betrachteten Risiken [7]. Für die vorliegende Arbeit steht dabei nicht die vollständige Klassifikation aller Supply Chain Risks im Vordergrund. Relevant sind vielmehr solche Ereignisse, die anhand verfügbarer Informationen erkannt und anschließend hinsichtlich ihrer möglichen Auswirkungen auf konkrete Lieferkettenstrukturen bewertet werden können.</w:t>
+      </w:r>
+    </w:p>
+    <w:p>
+      <w:r>
+        <w:t>Der systematische Umgang mit solchen Risiken innerhalb von Lieferketten wird in der Literatur als Supply Chain Risk Management bezeichnet. Fan und Stevenson strukturieren das Forschungsfeld anhand von vier Prozessen: Risk Identification, Risk Assessment, Risk Treatment und Risk Monitoring [8].</w:t>
       </w:r>
     </w:p>
     <w:p>
@@ -6770,18 +6784,17 @@
     </w:p>
     <w:p>
       <w:r>
-        <w:lastRenderedPageBreak/>
-        <w:t>Die Risikobewertung setzt dabei ein bereits identifiziertes Risiko voraus und untersucht dessen Relevanz sowie mögliche Auswirkungen für die Lieferkette. Choudhary, Singh, Schoenherr und Ramkumar untersuchen unterschiedliche Verfahren des Supply Chain Risk Assessment und systematisieren dabei unter anderem verwendete Bewertungsparameter, analytische Ansätze und Multi-Criteria-Decision-Making-Verfahren [7]. Für die Bewertung selbst können sowohl erhobene Daten als auch Experteneinschätzungen herangezogen werden; entsprechend kommen sowohl formale als auch informelle sowie quantitative und qualitative Verfahren zum Einsatz [6].</w:t>
-      </w:r>
-    </w:p>
-    <w:p>
-      <w:r>
-        <w:t>Die Auswirkungen eines Risikoereignisses sind dabei nicht ausschließlich auf ein einzelnes Unternehmen beschränkt. Aufgrund der Abhängigkeiten zwischen verschiedenen Lieferkettenstufen können sich Störungen entlang eines Liefernetzwerks auf nachgelagerte Akteure ausbreiten. Habibi et al. untersuchen solche Ausbreitungsprozesse in mehrstufigen Supply Chain Networks und zeigen, dass sowohl die Position einer Störung innerhalb der Lieferkette als auch die Netzwerkverbindungen deren Ausbreitung und Wiederherstellung beeinflussen [8]. Für die Analyse solcher Abhängigkeiten können Lieferketten als gerichtete Netzwerke modelliert werden, in denen Knoten Lieferkettenakteure oder Produktionsstandorte und Kanten deren Abhängigkeiten repräsentieren.</w:t>
-      </w:r>
-    </w:p>
-    <w:p>
-      <w:r>
-        <w:t>Risikoidentifikation und Risikobewertung erfüllen damit unterschiedliche Aufgaben: Zunächst muss erkannt werden, ob ein relevantes Ereignis vorliegt, bevor dessen mögliche Bedeutung für die betrachtete Lieferkette anhand definierter Bewertungsparameter und -verfahren beurteilt werden kann. Shahsavari et al. bearbeiten die vorgelagerte Identifikationsaufgabe anhand unstrukturierter Nachrichtentexte mit einem auf Sprachmodellen basierenden Ansatz [3]. Die Verarbeitung frei formulierter Nachrichtentexte stellt dabei besondere Anforderungen an die sprachliche Interpretation. Abschnitt 2.2 betrachtet daher die Möglichkeiten und Grenzen von Large Language Models für diese Aufgabe.</w:t>
+        <w:t>Die Risikobewertung setzt dabei ein bereits identifiziertes Risiko voraus und untersucht dessen Relevanz sowie mögliche Auswirkungen für die Lieferkette. Choudhary, Singh, Schoenherr und Ramkumar untersuchen unterschiedliche Verfahren des Supply Chain Risk Assessment und systematisieren dabei unter anderem verwendete Bewertungsparameter, analytische Ansätze und Multi-Criteria-Decision-Making-Verfahren [9]. Für die Bewertung selbst können sowohl erhobene Daten als auch Experteneinschätzungen herangezogen werden; entsprechend kommen sowohl formale als auch informelle sowie quantitative und qualitative Verfahren zum Einsatz [8].</w:t>
+      </w:r>
+    </w:p>
+    <w:p>
+      <w:r>
+        <w:t>Die Auswirkungen eines Risikoereignisses sind dabei nicht ausschließlich auf ein einzelnes Unternehmen beschränkt. Aufgrund der Abhängigkeiten zwischen verschiedenen Lieferkettenstufen können sich Störungen entlang eines Liefernetzwerks auf nachgelagerte Akteure ausbreiten. Habibi et al. untersuchen solche Ausbreitungsprozesse in mehrstufigen Supply Chain Networks und zeigen, dass sowohl die Position einer Störung innerhalb der Lieferkette als auch die Netzwerkverbindungen deren Ausbreitung und Wiederherstellung beeinflussen [10]. Für die Analyse solcher Abhängigkeiten können Lieferketten als gerichtete Netzwerke modelliert werden, in denen Knoten Lieferkettenakteure oder Produktionsstandorte und Kanten deren Abhängigkeiten repräsentieren.</w:t>
+      </w:r>
+    </w:p>
+    <w:p>
+      <w:r>
+        <w:t>Risikoidentifikation und Risikobewertung erfüllen damit unterschiedliche Aufgaben: Zunächst muss erkannt werden, ob ein relevantes Ereignis vorliegt, bevor dessen mögliche Bedeutung für die betrachtete Lieferkette anhand definierter Bewertungsparameter und -verfahren beurteilt werden kann. Shahsavari et al. bearbeiten die vorgelagerte Identifikationsaufgabe anhand unstrukturierter Nachrichtentexte mit einem auf Sprachmodellen basierenden Ansatz [5]. Die Verarbeitung frei formulierter Nachrichtentexte stellt dabei besondere Anforderungen an die sprachliche Interpretation. Abschnitt 2.2 betrachtet daher die Möglichkeiten und Grenzen von Large Language Models für diese Aufgabe.</w:t>
       </w:r>
     </w:p>
     <w:p>
@@ -6796,7 +6809,7 @@
     </w:p>
     <w:p>
       <w:r>
-        <w:t>Large Language Models (LLMs) sind universell einsetzbare, auf der Transformer-Architektur basierende Sprachmodelle, die auf umfangreichen Textkorpora trainiert werden. Durch ihre Fähigkeit zur Verarbeitung natürlicher Sprache können sie unter anderem Informationen aus Texten extrahieren, Inhalte klassifizieren und kontextabhängige Zusammenhänge interpretieren. Im Unterschied zu klassischen, auf einzelne Aufgaben spezialisierten NLP-Modellen können moderne LLMs viele dieser Aufgaben durch geeignete Instruktionen ohne zusätzliches domänenspezifisches Training bearbeiten.</w:t>
+        <w:t>Large Language Models (LLMs) sind universell einsetzbare, auf der Transformer-Architektur basierende Sprachmodelle [11], die auf umfangreichen Textkorpora trainiert werden. Durch ihre Fähigkeit zur Verarbeitung natürlicher Sprache können sie unter anderem Informationen aus Texten extrahieren, Inhalte klassifizieren und kontextabhängige Zusammenhänge interpretieren. Im Unterschied zu klassischen, auf einzelne Aufgaben spezialisierten NLP-Modellen können moderne LLMs viele dieser Aufgaben durch geeignete Instruktionen ohne zusätzliches domänenspezifisches Training bearbeiten [12].</w:t>
       </w:r>
     </w:p>
     <w:p>
@@ -6804,23 +6817,22 @@
         <w:t xml:space="preserve">Für die Analyse von Lieferketten ist diese Fähigkeit insbesondere deshalb relevant, weil ein wesentlicher Teil potenziell risikorelevanter Informationen nicht in strukturierten Unternehmensdatenbanken, sondern in unstrukturierten Quellen wie Nachrichtenartikeln, Unternehmenswebseiten oder öffentlichen Berichten vorliegt. AlMahri et al. </w:t>
       </w:r>
       <w:r>
-        <w:lastRenderedPageBreak/>
-        <w:t>zeigen, dass LLMs mittels Zero-Shot Prompting Unternehmen, Produkte, Standorte und Beziehungen aus öffentlich verfügbaren Textquellen extrahieren können. Auf diese Weise lassen sich unstrukturierte Informationen in strukturierte Repräsentationen überführen, ohne für jede Extraktionsaufgabe zunächst umfangreiche domänenspezifische Trainingsdaten erstellen zu müssen [9].</w:t>
-      </w:r>
-    </w:p>
-    <w:p>
-      <w:r>
-        <w:t>Für das Supply Chain Risk Management ist insbesondere die automatisierte Analyse von Nachrichten relevant. Shahsavari et al. entwickeln mit dem LUEI-Framework einen Ansatz zur Identifikation von Risikoereignissen in Nachrichtenquellen. Ausgehend von einem zu beobachtenden Ereignis werden verwandte Begriffe ermittelt und Nachrichten anschließend hinsichtlich ihrer Relevanz für dieses Ereignis bewertet. Ziel ist es, sogenannte Contributing Events frühzeitig in großen Nachrichtenmengen zu erkennen und damit die Risikoidentifikation zu unterstützen [3]. Der Ansatz verdeutlicht damit, dass LLM-basierte Verfahren insbesondere für den semantischen Verarbeitungsschritt zwischen einem unstrukturierten Nachrichtentext und einer strukturierten Beschreibung eines Lieferkettenereignisses eingesetzt werden können.</w:t>
-      </w:r>
-    </w:p>
-    <w:p>
-      <w:r>
-        <w:t>Eine weitergehende Herausforderung besteht in der Verbindung solcher Textinformationen mit strukturierten Lieferkettendaten. Strukturierte Tabellen und Datenbanken besitzen ein festes Schema und ermöglichen über formale Verfahren wie SQL oder Python eine präzise und reproduzierbare Datenabfrage. Für die direkte Verarbeitung durch ein LLM müssen tabellarische Informationen dagegen zunächst in eine lineare Textrepräsentation überführt werden. Bei großen Tabellen stoßen solche Ansätze zudem an Kontext- und Skalierungsgrenzen, weshalb in der Literatur Retrieval- und Selektionsmechanismen vorgeschlagen werden, bei denen dem Sprachmodell nur ein relevanter Ausschnitt der strukturierten Daten bereitgestellt wird [10]. Für Lieferkettenanalysen ergibt sich daraus eine grundsätzliche Aufgabenteilung: LLMs bieten Vorteile bei der semantischen Interpretation unstrukturierter Informationen, während strukturierte Daten weiterhin mit deterministischen Verfahren verarbeitet werden können.</w:t>
-      </w:r>
-    </w:p>
-    <w:p>
-      <w:r>
-        <w:t>Eine zentrale Einschränkung des Einsatzes von LLMs ist die Möglichkeit sogenannter Halluzinationen. Darunter fallen Ausgaben, die plausibel formuliert erscheinen, ohne durch überprüfbare Fakten oder den bereitgestellten Kontext gedeckt zu sein. Huang et al. unterscheiden dabei unter anderem zwischen Factuality Hallucinations, bei denen Aussagen von überprüfbaren Fakten abweichen, und Faithfulness Hallucinations, bei denen die Ausgabe nicht mit dem bereitgestellten Kontext oder den Instruktionen übereinstimmt [11]. Gerade bei der Lieferkettenrisikoanalyse ist dies relevant, da erzeugte Angaben über betroffene Unternehmen, Ereignisse oder Risikofaktoren unmittelbar in eine Bewertung einfließen können. Aktuelle Ansätze beschränken den Einsatz von LLMs deshalb zunehmend auf klar definierte Teilaufgaben und kombinieren sprachbasierte Verarbeitung mit strukturierten Datenquellen, deterministischen Berechnungen oder zusätzlichen Prüfmechanismen. Eine Möglichkeit zur organisatorischen Umsetzung einer solchen Aufgabenteilung stellen LLM-basierte Multi-Agenten-Systeme dar, die im folgenden Abschnitt betrachtet werden.</w:t>
+        <w:t>zeigen, dass LLMs mittels Zero-Shot Prompting Unternehmen, Produkte, Standorte und Beziehungen aus öffentlich verfügbaren Textquellen extrahieren können. Auf diese Weise lassen sich unstrukturierte Informationen in strukturierte Repräsentationen überführen, ohne für jede Extraktionsaufgabe zunächst umfangreiche domänenspezifische Trainingsdaten erstellen zu müssen [13].</w:t>
+      </w:r>
+    </w:p>
+    <w:p>
+      <w:r>
+        <w:t>Für das Supply Chain Risk Management ist insbesondere die automatisierte Analyse von Nachrichten relevant. Shahsavari et al. entwickeln mit dem LUEI-Framework einen Ansatz zur Identifikation von Risikoereignissen in Nachrichtenquellen. Ausgehend von einem zu beobachtenden Ereignis werden verwandte Begriffe ermittelt und Nachrichten anschließend hinsichtlich ihrer Relevanz für dieses Ereignis bewertet. Ziel ist es, sogenannte Contributing Events frühzeitig in großen Nachrichtenmengen zu erkennen und damit die Risikoidentifikation zu unterstützen [5]. Der Ansatz verdeutlicht damit, dass LLM-basierte Verfahren insbesondere für den semantischen Verarbeitungsschritt zwischen einem unstrukturierten Nachrichtentext und einer strukturierten Beschreibung eines Lieferkettenereignisses eingesetzt werden können.</w:t>
+      </w:r>
+    </w:p>
+    <w:p>
+      <w:r>
+        <w:t>Eine weitergehende Herausforderung besteht in der Verbindung solcher Textinformationen mit strukturierten Lieferkettendaten. Strukturierte Tabellen und Datenbanken besitzen ein festes Schema und ermöglichen über formale Verfahren wie SQL oder Python eine präzise und reproduzierbare Datenabfrage. Für die direkte Verarbeitung durch ein LLM müssen tabellarische Informationen dagegen zunächst in eine lineare Textrepräsentation überführt werden. Bei großen Tabellen stoßen solche Ansätze zudem an Kontext- und Skalierungsgrenzen, weshalb in der Literatur Retrieval- und Selektionsmechanismen vorgeschlagen werden, bei denen dem Sprachmodell nur ein relevanter Ausschnitt der strukturierten Daten bereitgestellt wird [14]. Für Lieferkettenanalysen ergibt sich daraus eine grundsätzliche Aufgabenteilung: LLMs bieten Vorteile bei der semantischen Interpretation unstrukturierter Informationen, während strukturierte Daten weiterhin mit deterministischen Verfahren verarbeitet werden können.</w:t>
+      </w:r>
+    </w:p>
+    <w:p>
+      <w:r>
+        <w:t>Eine zentrale Einschränkung des Einsatzes von LLMs ist die Möglichkeit sogenannter Halluzinationen. Darunter fallen Ausgaben, die plausibel formuliert erscheinen, ohne durch überprüfbare Fakten oder den bereitgestellten Kontext gedeckt zu sein. Huang et al. unterscheiden dabei unter anderem zwischen Factuality Hallucinations, bei denen Aussagen von überprüfbaren Fakten abweichen, und Faithfulness Hallucinations, bei denen die Ausgabe nicht mit dem bereitgestellten Kontext oder den Instruktionen übereinstimmt [15]. Gerade bei der Lieferkettenrisikoanalyse ist dies relevant, da erzeugte Angaben über betroffene Unternehmen, Ereignisse oder Risikofaktoren unmittelbar in eine Bewertung einfließen können. Aktuelle Ansätze beschränken den Einsatz von LLMs deshalb zunehmend auf klar definierte Teilaufgaben und kombinieren sprachbasierte Verarbeitung mit strukturierten Datenquellen, deterministischen Berechnungen oder zusätzlichen Prüfmechanismen. Eine Möglichkeit zur organisatorischen Umsetzung einer solchen Aufgabenteilung stellen LLM-basierte Multi-Agenten-Systeme dar, die im folgenden Abschnitt betrachtet werden.</w:t>
       </w:r>
     </w:p>
     <w:p>
@@ -6836,17 +6848,17 @@
     </w:p>
     <w:p>
       <w:r>
-        <w:t>Mit der zunehmenden Nutzung von Large Language Models entstehen neben einzelnen LLM-Anwendungen zunehmend Systeme, in denen mehrere spezialisierte Verarbeitungseinheiten gemeinsam eine übergeordnete Aufgabe bearbeiten. In LLM-basierten Multi-Agenten-Systemen werden Teilaufgaben unterschiedlichen Agenten beziehungsweise Rollen zugeordnet und deren Ergebnisse über definierte Interaktions- und Ablaufstrukturen miteinander verknüpft. Die einzelnen Agenten müssen dabei nicht notwendigerweise autonom miteinander verhandeln. Je nach Aufgabenstellung kann die Koordination auch durch einen vorgegebenen Workflow erfolgen, in dem Rollen, Abhängigkeiten und Ausführungsreihenfolge bereits vor der Laufzeit festgelegt sind [12].</w:t>
-      </w:r>
-    </w:p>
-    <w:p>
-      <w:r>
-        <w:t>Ein zentrales Gestaltungsprinzip solcher Systeme ist die Zerlegung komplexer Aufgaben in kleinere, funktional abgegrenzte Teilaufgaben. Hossain et al. beschreiben diese Task Decomposition als gerichteten Aufgabengraphen, dessen Knoten einzelne Teilaufgaben und dessen Kanten deren Abhängigkeiten repräsentieren. Jedem Verarbeitungsschritt kann dabei ein Modul entsprechend einer bestimmten funktionalen Rolle zugeordnet werden; die Rollenverteilung kann dynamisch erfolgen oder bereits statisch festgelegt sein [12]. Für Aufgaben, deren Verarbeitungsschritte und Abhängigkeiten bereits im Voraus bekannt sind, bietet sich eine statische Rollenzuweisung an. Dadurch lässt sich ein mehrstufiger Analyseprozess modular strukturieren, wobei die Ausgabe eines Verarbeitungsschritts als Eingabe für nachfolgende Schritte dienen kann.</w:t>
-      </w:r>
-    </w:p>
-    <w:p>
-      <w:r>
-        <w:t>Eine solche sequenzielle Verarbeitung ermöglicht eine klare Trennung unterschiedlicher Verantwortlichkeiten, bringt zugleich aber neue Abhängigkeiten zwischen den einzelnen Schritten mit sich. Fehler oder unvollständige Ergebnisse eines frühen Verarbeitungsschritts können an nachfolgende Komponenten weitergegeben werden und sich dadurch auf das Gesamtergebnis auswirken. Hossain et al. weisen deshalb bei mehrstufigen Agenten-Workflows ausdrücklich auf die Gefahr einer Fehlerfortpflanzung zwischen voneinander abhängigen Teilaufgaben hin [12]. Neben der eigentlichen Aufgabenzerlegung sind daher Mechanismen erforderlich, mit denen Zwischenergebnisse oder Endergebnisse geprüft und bei Bedarf erneut verarbeitet werden können.</w:t>
+        <w:t>Mit der zunehmenden Nutzung von Large Language Models entstehen neben einzelnen LLM-Anwendungen zunehmend Systeme, in denen mehrere spezialisierte Verarbeitungseinheiten gemeinsam eine übergeordnete Aufgabe bearbeiten. In LLM-basierten Multi-Agenten-Systemen werden Teilaufgaben unterschiedlichen Agenten beziehungsweise Rollen zugeordnet und deren Ergebnisse über definierte Interaktions- und Ablaufstrukturen miteinander verknüpft. Die einzelnen Agenten müssen dabei nicht notwendigerweise autonom miteinander verhandeln. Je nach Aufgabenstellung kann die Koordination auch durch einen vorgegebenen Workflow erfolgen, in dem Rollen, Abhängigkeiten und Ausführungsreihenfolge bereits vor der Laufzeit festgelegt sind [16].</w:t>
+      </w:r>
+    </w:p>
+    <w:p>
+      <w:r>
+        <w:t>Ein zentrales Gestaltungsprinzip solcher Systeme ist die Zerlegung komplexer Aufgaben in kleinere, funktional abgegrenzte Teilaufgaben. Hossain et al. beschreiben diese Task Decomposition als gerichteten Aufgabengraphen, dessen Knoten einzelne Teilaufgaben und dessen Kanten deren Abhängigkeiten repräsentieren. Jedem Verarbeitungsschritt kann dabei ein Modul entsprechend einer bestimmten funktionalen Rolle zugeordnet werden; die Rollenverteilung kann dynamisch erfolgen oder bereits statisch festgelegt sein [16]. Für Aufgaben, deren Verarbeitungsschritte und Abhängigkeiten bereits im Voraus bekannt sind, bietet sich eine statische Rollenzuweisung an. Dadurch lässt sich ein mehrstufiger Analyseprozess modular strukturieren, wobei die Ausgabe eines Verarbeitungsschritts als Eingabe für nachfolgende Schritte dienen kann.</w:t>
+      </w:r>
+    </w:p>
+    <w:p>
+      <w:r>
+        <w:t>Eine solche sequenzielle Verarbeitung ermöglicht eine klare Trennung unterschiedlicher Verantwortlichkeiten, bringt zugleich aber neue Abhängigkeiten zwischen den einzelnen Schritten mit sich. Fehler oder unvollständige Ergebnisse eines frühen Verarbeitungsschritts können an nachfolgende Komponenten weitergegeben werden und sich dadurch auf das Gesamtergebnis auswirken. Hossain et al. weisen deshalb bei mehrstufigen Agenten-Workflows ausdrücklich auf die Gefahr einer Fehlerfortpflanzung zwischen voneinander abhängigen Teilaufgaben hin [16]. Neben der eigentlichen Aufgabenzerlegung sind daher Mechanismen erforderlich, mit denen Zwischenergebnisse oder Endergebnisse geprüft und bei Bedarf erneut verarbeitet werden können.</w:t>
       </w:r>
     </w:p>
     <w:p>
@@ -6854,8 +6866,7 @@
         <w:t xml:space="preserve">Ein entsprechender Ansatz findet sich im Supply Chain Risk Management bei Quan et al. Das dort entwickelte MARS-Framework kombiniert strukturierte Risikofaktoren mit unstrukturierten Beschreibungen von Extremwetterereignissen. Für die Interpretation der unstrukturierten Informationen werden drei spezialisierte LLM-Agenten eingesetzt: Ein RiskAgent erzeugt zunächst eine Risikoeinschätzung, ein FeedbackAgent bewertet diese Einschätzung und ein RevisionAgent überarbeitet sie auf Grundlage des erzeugten Feedbacks. Die Agenten sind damit in einen definierten Feedback-Revision-Workflow eingebettet, bevor die resultierende Risikobewertung mit den strukturierten </w:t>
       </w:r>
       <w:r>
-        <w:lastRenderedPageBreak/>
-        <w:t>Indikatoren zusammengeführt wird [13]. Das Beispiel zeigt, dass Multi-Agenten-Architekturen in der Lieferkettenanalyse nicht ausschließlich für dezentrale Verhandlungen eingesetzt werden, sondern auch zur funktionalen Aufteilung und iterativen Prüfung eines mehrstufigen Analyseprozesses dienen können.</w:t>
+        <w:t>Indikatoren zusammengeführt wird [17]. Das Beispiel zeigt, dass Multi-Agenten-Architekturen in der Lieferkettenanalyse nicht ausschließlich für dezentrale Verhandlungen eingesetzt werden, sondern auch zur funktionalen Aufteilung und iterativen Prüfung eines mehrstufigen Analyseprozesses dienen können.</w:t>
       </w:r>
     </w:p>
     <w:p>
@@ -6880,16 +6891,15 @@
     </w:p>
     <w:p>
       <w:r>
-        <w:t>Shahsavari et al. konzentrieren sich auf die frühzeitige Identifikation von Lieferkettenrisiken aus Nachrichtendaten. Das entwickelte LUEI-Framework ermittelt zu einem vorgegebenen Risikoereignis verwandte Begriffe, sucht damit relevante Nachrichten und klassifiziert die gefundenen Meldungen hinsichtlich ihrer Relevanz [3]. Im Mittelpunkt steht damit die Phase der Risikoidentifikation. Der Ansatz zeigt, dass LLM-basierte Verfahren unstrukturierte Nachrichten für das Supply Chain Risk Management erschließen können; eine Verknüpfung des erkannten Ereignisses mit einer konkreten Menge betroffener Produktionsanlagen sowie eine Analyse der Weitergabe entlang einer mehrstufigen Lieferkette erfolgen dabei nicht.</w:t>
-      </w:r>
-    </w:p>
-    <w:p>
-      <w:r>
-        <w:t xml:space="preserve">Einen anderen Schwerpunkt setzen Kosasih et al. sowie AlMahri et al. Beide Arbeiten adressieren die begrenzte Sichtbarkeit komplexer Lieferketten und nutzen graphbasierte Repräsentationen zur Abbildung von Abhängigkeiten. Kosasih et al. verwenden Knowledge Graphs und Graph Neural Networks, um bislang unbekannte Beziehungen zwischen Unternehmen, Produkten, Produktionsfähigkeiten und weiteren Lieferketteninformationen zu inferieren [14]. Der Schwerpunkt liegt damit auf der Vervollständigung unvollständiger Lieferketteninformationen und der Erschließung versteckter Abhängigkeiten. AlMahri et al. kombinieren LLM-basierte Informationsextraktion mit Knowledge </w:t>
-      </w:r>
-      <w:r>
-        <w:lastRenderedPageBreak/>
-        <w:t>Graphs und überführen Informationen aus öffentlich verfügbaren Textquellen in eine strukturierte Darstellung mehrstufiger Lieferkettenbeziehungen. Die Fallstudie zur Elektrofahrzeug- und Batterielieferkette zeigt insbesondere die Eignung des Ansatzes zur Erweiterung der Supply Chain Visibility über die zweite Lieferantenebene hinaus [9].</w:t>
+        <w:t>Shahsavari et al. konzentrieren sich auf die frühzeitige Identifikation von Lieferkettenrisiken aus Nachrichtendaten. Das entwickelte LUEI-Framework ermittelt zu einem vorgegebenen Risikoereignis verwandte Begriffe, sucht damit relevante Nachrichten und klassifiziert die gefundenen Meldungen hinsichtlich ihrer Relevanz [5]. Im Mittelpunkt steht damit die Phase der Risikoidentifikation. Der Ansatz zeigt, dass LLM-basierte Verfahren unstrukturierte Nachrichten für das Supply Chain Risk Management erschließen können; eine Verknüpfung des erkannten Ereignisses mit einer konkreten Menge betroffener Produktionsanlagen sowie eine Analyse der Weitergabe entlang einer mehrstufigen Lieferkette erfolgen dabei nicht.</w:t>
+      </w:r>
+    </w:p>
+    <w:p>
+      <w:r>
+        <w:t xml:space="preserve">Einen anderen Schwerpunkt setzen Kosasih et al. sowie AlMahri et al. Beide Arbeiten adressieren die begrenzte Sichtbarkeit komplexer Lieferketten und nutzen graphbasierte Repräsentationen zur Abbildung von Abhängigkeiten. Kosasih et al. verwenden Knowledge Graphs und Graph Neural Networks, um bislang unbekannte Beziehungen zwischen Unternehmen, Produkten, Produktionsfähigkeiten und weiteren Lieferketteninformationen zu inferieren [18]. Der Schwerpunkt liegt damit auf der Vervollständigung unvollständiger Lieferketteninformationen und der Erschließung versteckter Abhängigkeiten. AlMahri et al. kombinieren LLM-basierte Informationsextraktion mit Knowledge </w:t>
+      </w:r>
+      <w:r>
+        <w:t>Graphs und überführen Informationen aus öffentlich verfügbaren Textquellen in eine strukturierte Darstellung mehrstufiger Lieferkettenbeziehungen. Die Fallstudie zur Elektrofahrzeug- und Batterielieferkette zeigt insbesondere die Eignung des Ansatzes zur Erweiterung der Supply Chain Visibility über die zweite Lieferantenebene hinaus [13].</w:t>
       </w:r>
     </w:p>
     <w:p>
@@ -6899,7 +6909,7 @@
     </w:p>
     <w:p>
       <w:r>
-        <w:t>Quan et al. kommen der in dieser Arbeit betrachteten Problemstellung stärker entgegen. Das MARS-Framework kombiniert strukturierte Risikofaktoren mit unstrukturierten Beschreibungen extremer Wetterereignisse und nutzt drei spezialisierte LLM-Agenten in einem Feedback-Revision-Workflow. Während strukturierte Faktoren deterministisch verarbeitet werden, interpretieren die Agenten die unstrukturierten Ereignisbeschreibungen und überführen sie in abgestufte Risikowerte. Anschließend werden beide Informationsarten zu einer gemeinsamen Bewertung aggregiert [13]. Damit zeigt die Arbeit sowohl die funktionale Aufteilung einer Risikobewertung auf mehrere spezialisierte Agenten als auch die Kombination sprachlich interpretierter und strukturiert berechneter Risikofaktoren.</w:t>
+        <w:t>Quan et al. kommen der in dieser Arbeit betrachteten Problemstellung stärker entgegen. Das MARS-Framework kombiniert strukturierte Risikofaktoren mit unstrukturierten Beschreibungen extremer Wetterereignisse und nutzt drei spezialisierte LLM-Agenten in einem Feedback-Revision-Workflow. Während strukturierte Faktoren deterministisch verarbeitet werden, interpretieren die Agenten die unstrukturierten Ereignisbeschreibungen und überführen sie in abgestufte Risikowerte. Anschließend werden beide Informationsarten zu einer gemeinsamen Bewertung aggregiert [17]. Damit zeigt die Arbeit sowohl die funktionale Aufteilung einer Risikobewertung auf mehrere spezialisierte Agenten als auch die Kombination sprachlich interpretierter und strukturiert berechneter Risikofaktoren.</w:t>
       </w:r>
     </w:p>
     <w:p>
@@ -6915,7 +6925,7 @@
     </w:p>
     <w:p>
       <w:r>
-        <w:t>Die betrachtete Literatur deckt einzelne Bausteine einer solchen Analysepipeline jeweils für sich ab: die semantische Auswertung unstrukturierter Ereignistexte, die strukturierte Abbildung von Lieferkettenbeziehungen sowie die funktionale Aufteilung einer Risikobewertung auf mehrere LLM-Agenten. Keine der betrachteten Arbeiten verbindet diese Bausteine in dieser Form zu einer durchgängigen, nachvollziehbaren Analysepipeline: die semantische Auswertung eines unstrukturierten Ereignistexts, die Extraktion risikorelevanter Merkmale, die Zuordnung zu konkreten Anlagen einer strukturierten Lieferkettendatenbasis, die Bestimmung potenziell betroffener nachgelagerter Anlagen über eine Netzwerkstruktur, eine reproduzierbare quantitative Priorisierung dieser Anlagen sowie die anschließende Erstellung und Prüfung eines erklärbaren Risikoberichts. Insbesondere die Trennung zwischen semantischer Interpretation durch LLM-Komponenten und deterministisch ausführbaren Operationen ist dabei relevant. LLMs ermöglichen die kontextabhängige Interpretation freier Texte und können zugleich faktisch unbelegte oder vom bereitgestellten Kontext abweichende Inhalte erzeugen [11]. Für berechenbare oder datenbankbasierte Schritte besteht daher ein Bedarf an Verfahren, deren Ergebnisse reproduzierbar und auf die zugrunde liegenden Daten zurückführbar bleiben.</w:t>
+        <w:t>Die betrachtete Literatur deckt einzelne Bausteine einer solchen Analysepipeline jeweils für sich ab: die semantische Auswertung unstrukturierter Ereignistexte, die strukturierte Abbildung von Lieferkettenbeziehungen sowie die funktionale Aufteilung einer Risikobewertung auf mehrere LLM-Agenten. Keine der betrachteten Arbeiten verbindet diese Bausteine in dieser Form zu einer durchgängigen, nachvollziehbaren Analysepipeline: die semantische Auswertung eines unstrukturierten Ereignistexts, die Extraktion risikorelevanter Merkmale, die Zuordnung zu konkreten Anlagen einer strukturierten Lieferkettendatenbasis, die Bestimmung potenziell betroffener nachgelagerter Anlagen über eine Netzwerkstruktur, eine reproduzierbare quantitative Priorisierung dieser Anlagen sowie die anschließende Erstellung und Prüfung eines erklärbaren Risikoberichts. Insbesondere die Trennung zwischen semantischer Interpretation durch LLM-Komponenten und deterministisch ausführbaren Operationen ist dabei relevant. LLMs ermöglichen die kontextabhängige Interpretation freier Texte und können zugleich faktisch unbelegte oder vom bereitgestellten Kontext abweichende Inhalte erzeugen [15]. Für berechenbare oder datenbankbasierte Schritte besteht daher ein Bedarf an Verfahren, deren Ergebnisse reproduzierbar und auf die zugrunde liegenden Daten zurückführbar bleiben.</w:t>
       </w:r>
     </w:p>
     <w:p>
@@ -6937,7 +6947,7 @@
     </w:p>
     <w:p>
       <w:r>
-        <w:t>Die vorliegende Arbeit orientiert sich am Design-Science-Research-Paradigma nach Hevner et al., da mit dem entwickelten Risikoanalysesystem ein IT-Artefakt entworfen, implementiert und anschließend evaluiert wird [15]. Ausgehend von der in den vorangegangenen Kapiteln beschriebenen Problemstellung werden zunächst Anforderungen an das System abgeleitet und in ein Systemdesign überführt. Anschließend erfolgt die prototypische Implementierung und die Evaluation anhand definierter Anwendungsszenarien.</w:t>
+        <w:t>Die vorliegende Arbeit orientiert sich am Design-Science-Research-Paradigma nach Hevner et al., da mit dem entwickelten Risikoanalysesystem ein IT-Artefakt entworfen, implementiert und anschließend evaluiert wird [19]. Ausgehend von der in den vorangegangenen Kapiteln beschriebenen Problemstellung werden zunächst Anforderungen an das System abgeleitet und in ein Systemdesign überführt. Anschließend erfolgt die prototypische Implementierung und die Evaluation anhand definierter Anwendungsszenarien.</w:t>
       </w:r>
     </w:p>
     <w:p>
@@ -7019,7 +7029,7 @@
         <w:t xml:space="preserve">Hallucination-Resistenz: </w:t>
       </w:r>
       <w:r>
-        <w:t>Large Language Models neigen zur Erzeugung plausibel klingender, durch die Eingabedaten nicht gedeckter Aussagen [11] (vgl. auch Abschnitt 2.2). Die Systemarchitektur muss diesem Risiko strukturell begegnen, nicht nur durch Formulierungsvorgaben im Prompt.</w:t>
+        <w:t>Large Language Models neigen zur Erzeugung plausibel klingender, durch die Eingabedaten nicht gedeckter Aussagen [15] (vgl. auch Abschnitt 2.2). Die Systemarchitektur muss diesem Risiko strukturell begegnen, nicht nur durch Formulierungsvorgaben im Prompt.</w:t>
       </w:r>
     </w:p>
     <w:p>
@@ -7056,7 +7066,7 @@
     </w:p>
     <w:p>
       <w:r>
-        <w:t>Ein einzelnes LLM erzeugt im Prinzip direkt aus einem Ereignistext einen fertigen Risikobericht. Das Problem dabei: In einem einzigen Modellaufruf muss es gleichzeitig den Text verstehen, die Datenbank abfragen, den Graphen durchsuchen, den Risikowert berechnen und den Bericht formulieren. Diese Teilaufgaben eignen sich nicht gleichermaßen für ein LLM: Textverständnis und Berichtsformulierung beherrscht ein LLM gut; eine exakte, reproduzierbare Rechnung wie die RiskScore-Berechnung dagegen nicht zuverlässig [16].</w:t>
+        <w:t>Ein einzelnes LLM erzeugt im Prinzip direkt aus einem Ereignistext einen fertigen Risikobericht. Das Problem dabei: In einem einzigen Modellaufruf muss es gleichzeitig den Text verstehen, die Datenbank abfragen, den Graphen durchsuchen, den Risikowert berechnen und den Bericht formulieren. Diese Teilaufgaben eignen sich nicht gleichermaßen für ein LLM: Textverständnis und Berichtsformulierung beherrscht ein LLM gut; eine exakte, reproduzierbare Rechnung wie die RiskScore-Berechnung dagegen nicht zuverlässig [20].</w:t>
       </w:r>
     </w:p>
     <w:p>
@@ -7098,7 +7108,7 @@
         </w:rPr>
       </w:pPr>
       <w:r>
-        <w:t>Jeder der sechs Schritte besitzt eine eigene, klar abgegrenzte Zuständigkeit und eine feste Schnittstelle zum gemeinsamen Pipeline-Zustand. Vier davon (Intake, Risk Assessment, Synthesis, Validation) treffen eine Entscheidung, die den weiteren Ablauf direkt beeinflusst: Intake entscheidet über die Fortsetzung der Verarbeitung, Validation über Notwendigkeit und Ansatzpunkt einer Wiederholung (Abschnitt 3.5). Die Koordination der Agenten erfolgt dabei nicht über direkte Funktionsaufrufe, sondern über den gemeinsamen Pipeline-Zustand, den jeder Schritt liest und weiterschreibt. Die grundsätzliche Existenz und Funktionsfähigkeit von LLM-Multi-Agenten-Systemen im Supply-Chain-Kontext ist damit belegt [17] [13]; deren konkrete Koordinationsmuster (Verhandlung zwischen Firmen-Agenten beziehungsweise eine Feedback-Revision-Schleife) unterscheiden sich vom hier gewählten, Zustands-basierten Muster und dienen nicht als direktes Vorbild dieser Koordinationsform.</w:t>
+        <w:t>Jeder der sechs Schritte besitzt eine eigene, klar abgegrenzte Zuständigkeit und eine feste Schnittstelle zum gemeinsamen Pipeline-Zustand. Vier davon (Intake, Risk Assessment, Synthesis, Validation) treffen eine Entscheidung, die den weiteren Ablauf direkt beeinflusst: Intake entscheidet über die Fortsetzung der Verarbeitung, Validation über Notwendigkeit und Ansatzpunkt einer Wiederholung (Abschnitt 3.5). Die Koordination der Agenten erfolgt dabei nicht über direkte Funktionsaufrufe, sondern über den gemeinsamen Pipeline-Zustand, den jeder Schritt liest und weiterschreibt. Die grundsätzliche Existenz und Funktionsfähigkeit von LLM-Multi-Agenten-Systemen im Supply-Chain-Kontext ist damit belegt [21] [17]; deren konkrete Koordinationsmuster (Verhandlung zwischen Firmen-Agenten beziehungsweise eine Feedback-Revision-Schleife) unterscheiden sich vom hier gewählten, Zustands-basierten Muster und dienen nicht als direktes Vorbild dieser Koordinationsform.</w:t>
       </w:r>
     </w:p>
     <w:p>
@@ -7209,27 +7219,14 @@
       <w:r>
         <w:t xml:space="preserve">Abbildung </w:t>
       </w:r>
-      <w:r>
-        <w:fldChar w:fldCharType="begin"/>
-      </w:r>
-      <w:r>
-        <w:instrText xml:space="preserve"> SEQ Abbildung \* ARABIC </w:instrText>
-      </w:r>
-      <w:r>
-        <w:fldChar w:fldCharType="separate"/>
-      </w:r>
-      <w:r>
-        <w:rPr>
-          <w:noProof/>
-        </w:rPr>
-        <w:t>1</w:t>
-      </w:r>
-      <w:r>
-        <w:rPr>
-          <w:noProof/>
-        </w:rPr>
-        <w:fldChar w:fldCharType="end"/>
-      </w:r>
+      <w:fldSimple w:instr=" SEQ Abbildung \* ARABIC ">
+        <w:r>
+          <w:rPr>
+            <w:noProof/>
+          </w:rPr>
+          <w:t>1</w:t>
+        </w:r>
+      </w:fldSimple>
       <w:bookmarkEnd w:id="16"/>
       <w:r>
         <w:t xml:space="preserve">: </w:t>
@@ -7352,24 +7349,14 @@
       <w:r>
         <w:t xml:space="preserve">Abbildung </w:t>
       </w:r>
-      <w:r>
-        <w:fldChar w:fldCharType="begin"/>
-      </w:r>
-      <w:r>
-        <w:instrText xml:space="preserve"> SEQ Abbildung \* ARABIC </w:instrText>
-      </w:r>
-      <w:r>
-        <w:fldChar w:fldCharType="separate"/>
-      </w:r>
-      <w:r>
-        <w:rPr>
-          <w:noProof/>
-        </w:rPr>
-        <w:t>2</w:t>
-      </w:r>
-      <w:r>
-        <w:fldChar w:fldCharType="end"/>
-      </w:r>
+      <w:fldSimple w:instr=" SEQ Abbildung \* ARABIC ">
+        <w:r>
+          <w:rPr>
+            <w:noProof/>
+          </w:rPr>
+          <w:t>2</w:t>
+        </w:r>
+      </w:fldSimple>
       <w:bookmarkEnd w:id="21"/>
       <w:r>
         <w:rPr>
@@ -7486,7 +7473,7 @@
     </w:p>
     <w:p>
       <w:r>
-        <w:t>Der Risk Assessment Agent liest denselben Text erneut und klassifiziert das Ereignis in drei Dimensionen: Schweregrad (severity, Werteskala eins bis fünf), Risikoart (risk_type, unter anderem Lieferunterbrechung, regulatorisches Risiko, Preisvolatilität; die Kategorien orientieren sich an etablierten Risikoklassifikationsschemata der Literatur [18]) und die Lieferkettenstufe, an der das Ereignis seinen Ursprung hat (origin_tier: Upstream, Midstream-BGM, Midstream-Cell oder Downstream). Alle drei Werte gehen unverändert in die RiskScore-Berechnung des Synthesis Agent ein (Abschnitt 4.3.3).</w:t>
+        <w:t>Der Risk Assessment Agent liest denselben Text erneut und klassifiziert das Ereignis in drei Dimensionen: Schweregrad (severity, Werteskala eins bis fünf), Risikoart (risk_type, unter anderem Lieferunterbrechung, regulatorisches Risiko, Preisvolatilität; die Kategorien orientieren sich an etablierten Risikoklassifikationsschemata der Literatur [22]) und die Lieferkettenstufe, an der das Ereignis seinen Ursprung hat (origin_tier: Upstream, Midstream-BGM, Midstream-Cell oder Downstream). Alle drei Werte gehen unverändert in die RiskScore-Berechnung des Synthesis Agent ein (Abschnitt 4.3.3).</w:t>
       </w:r>
     </w:p>
     <w:p>
@@ -7640,8 +7627,7 @@
         <w:t xml:space="preserve">Strategie C: LLM-gestützter Fallback. Für Ereignisse mit vorhandener Region ohne Material-Treffer und ohne genannte Firma (etwa ein regionales Extremwetterereignis ohne namentliche Erwähnung eines Unternehmens) finden die Strategien A und B trotz vorhandener Region nichts. Für diesen Fall existiert ein dritter, LLM-gestützter Weg mit einer für die Hallucination-Resistenz dieser Arbeit wichtigen Einschränkung: Eine rein deterministische Abfrage ohne LLM liefert zuerst eine abgeschlossene Liste </w:t>
       </w:r>
       <w:r>
-        <w:lastRenderedPageBreak/>
-        <w:t>realer Anlagen, deren Ort zur genannten Region passt. Erst danach erhält das LLM diese Liste und den Ereignistext und wählt daraus die tatsächlich betroffenen Anlagen aus. Eine Auswahl außerhalb dieser Liste ist ausgeschlossen. Jede zurückgegebene Auswahl durchläuft zusätzlich eine Prüfung gegen die ursprüngliche Kandidatenliste, bevor das System sie übernimmt. Dieses Vorgehen (Retrieval zuerst, LLM-Auswahl ausschließlich aus dem bereits geprüften Ergebnis) bindet die Sprachmodellausgabe an zuvor abgerufene, überprüfbare Information, statt sich allein auf im Modell gespeichertes Wissen zu verlassen. Retrieval zählt damit zu den in der Literatur dokumentierten Ansätzen zur Eindämmung von Halluzinationen [11]. Strategie C verwendet dafür einen einfachen deterministischen Abgleich gegen Orts- und Namensfelder der Anlagendaten (Abschnitt 4.3.2), kein trainiertes Retrieval-Modell. Dieses Grundprinzip entspricht zugleich der Trennung zwischen Berechnung und Sprache aus Abschnitt 3.2.1.</w:t>
+        <w:t>realer Anlagen, deren Ort zur genannten Region passt. Erst danach erhält das LLM diese Liste und den Ereignistext und wählt daraus die tatsächlich betroffenen Anlagen aus. Eine Auswahl außerhalb dieser Liste ist ausgeschlossen. Jede zurückgegebene Auswahl durchläuft zusätzlich eine Prüfung gegen die ursprüngliche Kandidatenliste, bevor das System sie übernimmt. Dieses Vorgehen (Retrieval zuerst, LLM-Auswahl ausschließlich aus dem bereits geprüften Ergebnis) bindet die Sprachmodellausgabe an zuvor abgerufene, überprüfbare Information, statt sich allein auf im Modell gespeichertes Wissen zu verlassen. Retrieval zählt damit zu den in der Literatur dokumentierten Ansätzen zur Eindämmung von Halluzinationen [15]. Strategie C verwendet dafür einen einfachen deterministischen Abgleich gegen Orts- und Namensfelder der Anlagendaten (Abschnitt 4.3.2), kein trainiertes Retrieval-Modell. Dieses Grundprinzip entspricht zugleich der Trennung zwischen Berechnung und Sprache aus Abschnitt 3.2.1.</w:t>
       </w:r>
     </w:p>
     <w:p>
@@ -7837,24 +7823,14 @@
       <w:r>
         <w:t xml:space="preserve">Tabelle </w:t>
       </w:r>
-      <w:r>
-        <w:fldChar w:fldCharType="begin"/>
-      </w:r>
-      <w:r>
-        <w:instrText xml:space="preserve"> SEQ Tabelle \* ARABIC </w:instrText>
-      </w:r>
-      <w:r>
-        <w:fldChar w:fldCharType="separate"/>
-      </w:r>
-      <w:r>
-        <w:rPr>
-          <w:noProof/>
-        </w:rPr>
-        <w:t>1</w:t>
-      </w:r>
-      <w:r>
-        <w:fldChar w:fldCharType="end"/>
-      </w:r>
+      <w:fldSimple w:instr=" SEQ Tabelle \* ARABIC ">
+        <w:r>
+          <w:rPr>
+            <w:noProof/>
+          </w:rPr>
+          <w:t>1</w:t>
+        </w:r>
+      </w:fldSimple>
       <w:bookmarkEnd w:id="39"/>
       <w:r>
         <w:t>: Technologie-Stack der Implementierung</w:t>
@@ -8253,7 +8229,7 @@
     </w:p>
     <w:p>
       <w:r>
-        <w:t>Als Datenbasis dient die NAATBatt North American Lithium-Ion Battery Supply Chain Database (Stand März 2026) [19], ein von NREL und NAATBatt International gepflegtes Verzeichnis nordamerikanischer Anlagen der Batterie-Lieferkette. Die Datenbank enthält Angaben zu Unternehmen, Standort, Lieferkettenstufe, Produkttyp und, für einen Teil der Anlagen, Produktionskapazität; Lieferbeziehungen zwischen den Anlagen enthält sie nicht, wie in Abschnitt 3.1 dargelegt.</w:t>
+        <w:t>Als Datenbasis dient die NAATBatt North American Lithium-Ion Battery Supply Chain Database (Stand März 2026) [23], ein von NREL und NAATBatt International gepflegtes Verzeichnis nordamerikanischer Anlagen der Batterie-Lieferkette. Die Datenbank enthält Angaben zu Unternehmen, Standort, Lieferkettenstufe, Produkttyp und, für einen Teil der Anlagen, Produktionskapazität; Lieferbeziehungen zwischen den Anlagen enthält sie nicht, wie in Abschnitt 3.1 dargelegt.</w:t>
       </w:r>
     </w:p>
     <w:p>
@@ -8263,12 +8239,9 @@
     </w:p>
     <w:p>
       <w:r>
-        <w:t>Mehrere Felder, die in die spätere Risikoberechnung eingehen, sind in der Rohdatenbank nicht enthalten und werden bei der Aufbereitung ergänzt: Materialschlüsselwörter aus dem Produktfeld, eine binäre Einstufung der Importabhängigkeit und der Lieferantenkonzentration je Material auf Basis von Literaturschwellenwerten (USGS Mineral Commodity Summaries 2026, IEA Global Critical Minerals Outlook 2025), sowie eine gewichtete, materialspezifische Herkunftsregion. Für Letztere zieht die Implementierung für jede Anlage und jedes zugeordnete Material unabhängig eine Zufallsstichprobe aus einer literaturbasierten Verteilung der Länderanteile an der weltweiten Förderung, mit festem, aus Anlagen-ID und Material abgeleitetem Zufallssaat zur Repro</w:t>
-      </w:r>
-      <w:r>
-        <w:lastRenderedPageBreak/>
-        <w:t>duzierbarkeit. Diese Verteilung ist für die fünf ursprünglich modellierten Rohstoffe differenziert nach einzelnen Ländern hinterlegt, darunter für Lithium vier benannte Herkunftsländer (Australien, Chile, China, Argentinien) an Stelle einer zuvor undifferenzierten Sammelkategorie.</w:t>
-      </w:r>
+        <w:t>Mehrere Felder, die in die spätere Risikoberechnung eingehen, sind in der Rohdatenbank nicht enthalten und werden bei der Aufbereitung ergänzt: Materialschlüsselwörter aus dem Produktfeld, eine binäre Einstufung der Importabhängigkeit und der Lieferantenkonzentration je Material auf Basis von Literaturschwellenwerten [2] [3], sowie eine gewichtete, materialspezifische Herkunftsregion. Für Letztere zieht die Implementierung für jede Anlage und jedes zugeordnete Material unabhängig eine Zufallsstichprobe aus einer literaturbasierten Verteilung der Länderanteile an der weltweiten Förderung, mit festem, aus Anlagen-ID und Material abgeleitetem Zufallssaat zur Reproduzierbarkeit. Diese Verteilung ist für die fünf ursprünglich modellierten Rohstoffe differenziert nach einzelnen Ländern hinterlegt, darunter für Lithium vier benannte Herkunftsländer (Australien, Chile, China, Argentinien) an Stelle einer zuvor undifferenzierten Sammelkategorie.</w:t>
+      </w:r>
+      <w:r/>
     </w:p>
     <w:p>
       <w:pPr>
@@ -8339,24 +8312,14 @@
       <w:r>
         <w:t xml:space="preserve">Tabelle </w:t>
       </w:r>
-      <w:r>
-        <w:fldChar w:fldCharType="begin"/>
-      </w:r>
-      <w:r>
-        <w:instrText xml:space="preserve"> SEQ Tabelle \* ARABIC </w:instrText>
-      </w:r>
-      <w:r>
-        <w:fldChar w:fldCharType="separate"/>
-      </w:r>
-      <w:r>
-        <w:rPr>
-          <w:noProof/>
-        </w:rPr>
-        <w:t>2</w:t>
-      </w:r>
-      <w:r>
-        <w:fldChar w:fldCharType="end"/>
-      </w:r>
+      <w:fldSimple w:instr=" SEQ Tabelle \* ARABIC ">
+        <w:r>
+          <w:rPr>
+            <w:noProof/>
+          </w:rPr>
+          <w:t>2</w:t>
+        </w:r>
+      </w:fldSimple>
       <w:bookmarkEnd w:id="45"/>
       <w:r>
         <w:rPr>
@@ -8510,7 +8473,7 @@
           </w:tcPr>
           <w:p>
             <w:r>
-              <w:t>Regelbasierte Näherung an Stelle einer anlagenspezifischen Messung, auf Basis von Literaturschwellenwerten (USGS Mineral Commodity Summaries 2026, IEA Global Critical Minerals Outlook 2025)</w:t>
+              <w:t>Regelbasierte Näherung an Stelle einer anlagenspezifischen Messung, auf Basis von Literaturschwellenwerten [2] [3]</w:t>
             </w:r>
           </w:p>
         </w:tc>
@@ -8801,7 +8764,6 @@
               <w:ind w:right="284"/>
               <w:jc w:val="right"/>
               <w:rPr>
-                <w:rFonts w:hint="eastAsia"/>
                 <w:i/>
                 <w:lang w:val="en-US" w:eastAsia="zh-CN"/>
               </w:rPr>
@@ -9136,7 +9098,7 @@
         </w:rPr>
       </w:pPr>
       <w:r>
-        <w:t>Der Schweregrad (Severity) entstammt unmittelbar der Einstufung durch den Risk Assessment Agent und ist für alle Anlagen desselben Ereignisses identisch; er beeinflusst damit nicht die Rangfolge innerhalb eines Ereignisses, sondern ausschließlich den absoluten Vergleich zwischen unterschiedlichen Ereignissen. Das Stufengewicht (TierWeight) bildet die strukturelle Entfernung einer Anlage von der Ursprungsstufe des Ereignisses auf einen Wert zwischen null Komma fünfzehn und eins ab, mit dem größten Gewicht bei Übereinstimmung der Stufe. Diese stufenabhängige Gewichtung setzt den empirischen Befund um, dass sich die Auswirkungen einer Störung zwischen den Lieferkettenstufen eines mehrstufigen Netzwerks deutlich und systematisch unterscheiden, statt sich gleichmäßig über alle Stufen zu verteilen [8]; die konkrete Abnahme des Gewichts mit wachsender Entfernung zur Ursprungsstufe stellt dabei eine vereinfachende Modellannahme dieser Arbeit dar, die von der in der zitierten Studie beobachteten, netzwerkpositionsabhängigen Konzentration der Störungsdauer in späteren Stufen abweicht. Die Vulnerabilität (Vulnerability) ergibt sich als gewichtete Summe aus vier Teiltermen:</w:t>
+        <w:t>Der Schweregrad (Severity) entstammt unmittelbar der Einstufung durch den Risk Assessment Agent und ist für alle Anlagen desselben Ereignisses identisch; er beeinflusst damit nicht die Rangfolge innerhalb eines Ereignisses, sondern ausschließlich den absoluten Vergleich zwischen unterschiedlichen Ereignissen. Das Stufengewicht (TierWeight) bildet die strukturelle Entfernung einer Anlage von der Ursprungsstufe des Ereignisses auf einen Wert zwischen null Komma fünfzehn und eins ab, mit dem größten Gewicht bei Übereinstimmung der Stufe. Diese stufenabhängige Gewichtung setzt den empirischen Befund um, dass sich die Auswirkungen einer Störung zwischen den Lieferkettenstufen eines mehrstufigen Netzwerks deutlich und systematisch unterscheiden, statt sich gleichmäßig über alle Stufen zu verteilen [10]; die konkrete Abnahme des Gewichts mit wachsender Entfernung zur Ursprungsstufe stellt dabei eine vereinfachende Modellannahme dieser Arbeit dar, die von der in der zitierten Studie beobachteten, netzwerkpositionsabhängigen Konzentration der Störungsdauer in späteren Stufen abweicht. Die Vulnerabilität (Vulnerability) ergibt sich als gewichtete Summe aus vier Teiltermen:</w:t>
       </w:r>
     </w:p>
     <w:tbl>
@@ -9524,8 +9486,7 @@
         <w:t>wobei ImportDep und SupplierConc die in Abschnitt 4.2.1 beschriebenen, literaturbasierten Einstufungen darstellen, SingleSourceDep den Kehrwert der Anzahl direkter Lieferanten einer Anlage im Graphen abbildet und LeadTimeNorm eine normierte Vor</w:t>
       </w:r>
       <w:r>
-        <w:lastRenderedPageBreak/>
-        <w:t>laufzeit-Schätzung auf Basis von Stufe, Material, Region und Datenverfügbarkeit darstellt. Die Auswahl von ImportDep, SupplierConc und SingleSourceDep greift eine großangelegte Befragung von Führungskräften auf, die strukturelle Merkmale von Lieferbeziehungen (darunter die Konzentration auf wenige Bezugsquellen und den Anteil importierter Vorleistungen) unabhängig voneinander als bedeutsam für die Risikoexposition eines Unternehmens identifiziert [20]. Die Einbeziehung der Vorlaufzeit als vierter Teilterm folgt dem empirischen Befund, dass sich die Auswirkungen einer Störung mit zunehmender Vorlaufzeit verschärfen [21]. Der Resilienz-Abschlag (ResilienceDiscount)</w:t>
+        <w:t>laufzeit-Schätzung auf Basis von Stufe, Material, Region und Datenverfügbarkeit darstellt. Die Auswahl von ImportDep, SupplierConc und SingleSourceDep greift eine großangelegte Befragung von Führungskräften auf, die strukturelle Merkmale von Lieferbeziehungen (darunter die Konzentration auf wenige Bezugsquellen und den Anteil importierter Vorleistungen) unabhängig voneinander als bedeutsam für die Risikoexposition eines Unternehmens identifiziert [24]. Die Einbeziehung der Vorlaufzeit als vierter Teilterm folgt dem empirischen Befund, dass sich die Auswirkungen einer Störung mit zunehmender Vorlaufzeit verschärfen [25]. Der Resilienz-Abschlag (ResilienceDiscount)</w:t>
       </w:r>
       <w:r>
         <w:rPr>
@@ -9826,7 +9787,7 @@
     </w:tbl>
     <w:p>
       <w:r>
-        <w:t xml:space="preserve">Diese Konstruktion überträgt den in der Literatur beschriebenen Zusammenhang zwischen redundanter, andernorts verfügbarer Kapazität und der Widerstandsfähigkeit einer Lieferkette gegenüber Störungen auf eine einzelne Kennzahl: Je größer der Anteil verfügbarer Ausweichkapazität, desto geringer der Abschlag [22]. </w:t>
+        <w:t xml:space="preserve">Diese Konstruktion überträgt den in der Literatur beschriebenen Zusammenhang zwischen redundanter, andernorts verfügbarer Kapazität und der Widerstandsfähigkeit einer Lieferkette gegenüber Störungen auf eine einzelne Kennzahl: Je größer der Anteil verfügbarer Ausweichkapazität, desto geringer der Abschlag [26]. </w:t>
       </w:r>
       <w:r>
         <w:t>Vergleichbare Kapazitätsdaten liegen nur für Upstream- und Midstream-Cell-Anlagen vor, deren Kapazitäten in einheitlichen Mengeneinheiten vorliegen; für nicht vergleichbare Stufen (Midstream-BGM, Downstream) oder wenn der Nenner dieses Anteils strukturell nicht bestimmbar ist (etwa bei einem über Strategie B geseedeten Ereignis ohne zugeordnetes Material), verwendet das System den konservativen Standardwert CapacityShare = 1,0, was einem Resilienz-Abschlag von null entspricht: Eine unklare oder strukturell nicht vergleichbare Datenlage führt damit zu keiner Verringerung des berechneten Risikowerts</w:t>
@@ -10641,24 +10602,14 @@
       <w:r>
         <w:t xml:space="preserve">Tabelle </w:t>
       </w:r>
-      <w:r>
-        <w:fldChar w:fldCharType="begin"/>
-      </w:r>
-      <w:r>
-        <w:instrText xml:space="preserve"> SEQ Tabelle \* ARABIC </w:instrText>
-      </w:r>
-      <w:r>
-        <w:fldChar w:fldCharType="separate"/>
-      </w:r>
-      <w:r>
-        <w:rPr>
-          <w:noProof/>
-        </w:rPr>
-        <w:t>4</w:t>
-      </w:r>
-      <w:r>
-        <w:fldChar w:fldCharType="end"/>
-      </w:r>
+      <w:fldSimple w:instr=" SEQ Tabelle \* ARABIC ">
+        <w:r>
+          <w:rPr>
+            <w:noProof/>
+          </w:rPr>
+          <w:t>4</w:t>
+        </w:r>
+      </w:fldSimple>
       <w:bookmarkEnd w:id="62"/>
       <w:r>
         <w:rPr>
@@ -11166,24 +11117,14 @@
       <w:r>
         <w:t xml:space="preserve">Tabelle </w:t>
       </w:r>
-      <w:r>
-        <w:fldChar w:fldCharType="begin"/>
-      </w:r>
-      <w:r>
-        <w:instrText xml:space="preserve"> SEQ Tabelle \* ARABIC </w:instrText>
-      </w:r>
-      <w:r>
-        <w:fldChar w:fldCharType="separate"/>
-      </w:r>
-      <w:r>
-        <w:rPr>
-          <w:noProof/>
-        </w:rPr>
-        <w:t>5</w:t>
-      </w:r>
-      <w:r>
-        <w:fldChar w:fldCharType="end"/>
-      </w:r>
+      <w:fldSimple w:instr=" SEQ Tabelle \* ARABIC ">
+        <w:r>
+          <w:rPr>
+            <w:noProof/>
+          </w:rPr>
+          <w:t>5</w:t>
+        </w:r>
+      </w:fldSimple>
       <w:bookmarkEnd w:id="66"/>
       <w:r>
         <w:rPr>
@@ -11839,7 +11780,7 @@
     </w:p>
     <w:p>
       <w:r>
-        <w:t xml:space="preserve">Im Vergleich zu kommerziellen Überwachungsplattformen wie Prewave [2] oder Resilinc [1], deren Risikoeinschätzungen für Nutzende nicht im Detail nachvollziehbar sind, macht der entwickelte Prototyp jede Kennzahl auf eine konkrete Berechnung oder eine Textstelle im Ausgangsmaterial rückführbar. Diese Nachvollziehbarkeit erstreckt sich derzeit auf die berechneten Werte selbst; die Ausbreitung über die Lieferkette wird im </w:t>
+        <w:t xml:space="preserve">Im Vergleich zu kommerziellen Überwachungsplattformen wie Prewave [4] oder Resilinc [1], deren Risikoeinschätzungen für Nutzende nicht im Detail nachvollziehbar sind, macht der entwickelte Prototyp jede Kennzahl auf eine konkrete Berechnung oder eine Textstelle im Ausgangsmaterial rückführbar. Diese Nachvollziehbarkeit erstreckt sich derzeit auf die berechneten Werte selbst; die Ausbreitung über die Lieferkette wird im </w:t>
       </w:r>
       <w:r>
         <w:lastRenderedPageBreak/>
@@ -11911,7 +11852,7 @@
     </w:p>
     <w:p>
       <w:r>
-        <w:t>In diesem Zusammenhang stellt auch Retrieval-Augmented Generation eine mögliche Erweiterung dar. Für die gegenwärtige Datenbasis ist ein klassisches vektorbasiertes RAG-System nicht zwingend erforderlich, da die relevanten Informationen überwiegend strukturiert in Tabellen und im Lieferkettengraphen vorliegen und sich deterministisch abfragen lassen. Das in Abschnitt 3.4.2 beschriebene Vorgehen der Strategie C folgt bereits im Kern einem Retrieval-Augmented-Generation- Muster, allerdings ausschließlich für die Zuordnung zu Anlagen des Lieferkettengraphen. Bei einer zukünftigen Erweiterung um größere Mengen unstrukturierter Informationen (historische Risikoereignisse, Unternehmensberichte, regulatorische Dokumente oder technische Wissensbestände) stellt ein Retrieval-System dagegen relevante Dokumente gezielt für die Analyse bereit und unterstützt damit sowohl die Einordnung neuer Ereignisse anhand ähnlicher historischer Fälle als auch die im vorherigen Absatz beschriebene Faktenprüfung; Huang et al. ordnen ein solches Retrieval als in der Literatur diskutierten Ansatz zur Eindämmung wissenslückenbedingter Halluzinationen ein und weisen zugleich auf dessen Grenzen hin [11].</w:t>
+        <w:t>In diesem Zusammenhang stellt auch Retrieval-Augmented Generation eine mögliche Erweiterung dar. Für die gegenwärtige Datenbasis ist ein klassisches vektorbasiertes RAG-System nicht zwingend erforderlich, da die relevanten Informationen überwiegend strukturiert in Tabellen und im Lieferkettengraphen vorliegen und sich deterministisch abfragen lassen. Das in Abschnitt 3.4.2 beschriebene Vorgehen der Strategie C folgt bereits im Kern einem Retrieval-Augmented-Generation- Muster, allerdings ausschließlich für die Zuordnung zu Anlagen des Lieferkettengraphen. Bei einer zukünftigen Erweiterung um größere Mengen unstrukturierter Informationen (historische Risikoereignisse, Unternehmensberichte, regulatorische Dokumente oder technische Wissensbestände) stellt ein Retrieval-System dagegen relevante Dokumente gezielt für die Analyse bereit und unterstützt damit sowohl die Einordnung neuer Ereignisse anhand ähnlicher historischer Fälle als auch die im vorherigen Absatz beschriebene Faktenprüfung; Huang et al. ordnen ein solches Retrieval als in der Literatur diskutierten Ansatz zur Eindämmung wissenslückenbedingter Halluzinationen ein und weisen zugleich auf dessen Grenzen hin [15].</w:t>
       </w:r>
     </w:p>
     <w:p>
@@ -11985,7 +11926,17 @@
         <w:t xml:space="preserve">RESILINC: Illumination: 2025 Annual Supply Chain Report, 2025. </w:t>
       </w:r>
       <w:r>
-        <w:t>Online unter: https://resilinc.ai/learning-center/white-papers-reports/illumination-2025-annual-supply-chain-report/ (Abrufdatum: 21.08.2026).</w:t>
+        <w:t>Online unter: https://resilinc.ai/learning-center/white-papers-reports/illumination-2025-annual-supply-chain-report/ (Abrufdatum: 2</w:t>
+      </w:r>
+      <w:r>
+        <w:rPr>
+          <w:rFonts w:hint="eastAsia"/>
+          <w:lang w:eastAsia="zh-CN"/>
+        </w:rPr>
+        <w:t>8</w:t>
+      </w:r>
+      <w:r>
+        <w:t>.08.2026).</w:t>
       </w:r>
     </w:p>
     <w:p>
@@ -11998,13 +11949,7 @@
         <w:ind w:hanging="720"/>
       </w:pPr>
       <w:r>
-        <w:rPr>
-          <w:lang w:val="en-US"/>
-        </w:rPr>
-        <w:t xml:space="preserve">PREWAVE GMBH: AI Supply Chain Monitoring, 2026. </w:t>
-      </w:r>
-      <w:r>
-        <w:t>Online unter: https://www.prewave.com/ (Abrufdatum: 21.08.2026).</w:t>
+        <w:t>U.S. GEOLOGICAL SURVEY: Mineral Commodity Summaries 2026, 2026. Online unter: https://www.usgs.gov/publications/mineral-commodity-summaries-2026 (Abrufdatum: 28.08.2026).</w:t>
       </w:r>
     </w:p>
     <w:p>
@@ -12015,15 +11960,9 @@
           <w:numId w:val="3"/>
         </w:numPr>
         <w:ind w:hanging="720"/>
-        <w:rPr>
-          <w:lang w:val="en-US"/>
-        </w:rPr>
-      </w:pPr>
-      <w:r>
-        <w:rPr>
-          <w:lang w:val="en-US"/>
-        </w:rPr>
-        <w:t>SHAHSAVARI, M.; HUSSAIN, O. K.; SABERI, M.; SHARMA, P.: Event identification for supply chain risk management through news analysis by using large language models. The Review of Socionetwork Strategies, 18, S. 255–278, 2024. DOI: 10.1007/s12626-024-00169-z (Abrufdatum: 21.08.2026).</w:t>
+      </w:pPr>
+      <w:r>
+        <w:t>INTERNATIONAL ENERGY AGENCY: Global Critical Minerals Outlook 2025, 2025. Online unter: https://www.iea.org/reports/global-critical-minerals-outlook-2025 (Abrufdatum: 28.08.2026).</w:t>
       </w:r>
     </w:p>
     <w:p>
@@ -12034,15 +11973,15 @@
           <w:numId w:val="3"/>
         </w:numPr>
         <w:ind w:hanging="720"/>
+      </w:pPr>
+      <w:r>
         <w:rPr>
           <w:lang w:val="en-US"/>
         </w:rPr>
-      </w:pPr>
-      <w:r>
-        <w:rPr>
-          <w:lang w:val="en-US"/>
-        </w:rPr>
-        <w:t>HECKMANN, I.; COMES, T.; NICKEL, S.: A critical review on supply chain risk – Definition, measure and modeling. Omega, 52, S. 119–132, 2015. DOI: 10.1016/j.omega.2014.10.004 (Abrufdatum: 20.08.2026).</w:t>
+        <w:t xml:space="preserve">PREWAVE GMBH: AI Supply Chain Monitoring, 2026. </w:t>
+      </w:r>
+      <w:r>
+        <w:t>Online unter: https://www.prewave.com/ (Abrufdatum: 21.08.2026).</w:t>
       </w:r>
     </w:p>
     <w:p>
@@ -12053,15 +11992,15 @@
           <w:numId w:val="3"/>
         </w:numPr>
         <w:ind w:hanging="720"/>
-      </w:pPr>
-      <w:r>
         <w:rPr>
           <w:lang w:val="en-US"/>
         </w:rPr>
-        <w:t xml:space="preserve">HO, W.; ZHENG, T.; YILDIZ, H.; TALLURI, S.: Supply chain risk management: a literature review. </w:t>
-      </w:r>
-      <w:r>
-        <w:t>International Journal of Production Research, 53(16), S. 5031–5069, 2015. DOI: 10.1080/00207543.2015.1030467 (Abrufdatum: 20.08.2026).</w:t>
+      </w:pPr>
+      <w:r>
+        <w:rPr>
+          <w:lang w:val="en-US"/>
+        </w:rPr>
+        <w:t>SHAHSAVARI, M.; HUSSAIN, O. K.; SABERI, M.; SHARMA, P.: Event identification for supply chain risk management through news analysis by using large language models. The Review of Socionetwork Strategies, 18, S. 255–278, 2024. DOI: 10.1007/s12626-024-00169-z (Abrufdatum: 21.08.2026).</w:t>
       </w:r>
     </w:p>
     <w:p>
@@ -12080,7 +12019,7 @@
         <w:rPr>
           <w:lang w:val="en-US"/>
         </w:rPr>
-        <w:t>FAN, Y.; STEVENSON, M.: A review of supply chain risk management: definition, theory, and research agenda. International Journal of Physical Distribution &amp; Logistics Management, 48(3), S. 205–230, 2018. DOI: 10.1108/IJPDLM-01-2017-0043 (Abrufdatum: 20.08.2026).</w:t>
+        <w:t>HECKMANN, I.; COMES, T.; NICKEL, S.: A critical review on supply chain risk – Definition, measure and modeling. Omega, 52, S. 119–132, 2015. DOI: 10.1016/j.omega.2014.10.004 (Abrufdatum: 20.08.2026).</w:t>
       </w:r>
     </w:p>
     <w:p>
@@ -12096,10 +12035,10 @@
         <w:rPr>
           <w:lang w:val="en-US"/>
         </w:rPr>
-        <w:t xml:space="preserve">CHOUDHARY, N. A.; SINGH, S.; SCHOENHERR, T.; RAMKUMAR, M.: Risk assessment in supply chains: a state-of-the-art review of methodologies and their applications. </w:t>
-      </w:r>
-      <w:r>
-        <w:t>Annals of Operations Research, 322(2), S. 565–607, 2023. DOI: 10.1007/s10479-022-04700-9 (Abrufdatum: 21.08.2026).</w:t>
+        <w:t xml:space="preserve">HO, W.; ZHENG, T.; YILDIZ, H.; TALLURI, S.: Supply chain risk management: a literature review. </w:t>
+      </w:r>
+      <w:r>
+        <w:t>International Journal of Production Research, 53(16), S. 5031–5069, 2015. DOI: 10.1080/00207543.2015.1030467 (Abrufdatum: 20.08.2026).</w:t>
       </w:r>
     </w:p>
     <w:p>
@@ -12110,15 +12049,15 @@
           <w:numId w:val="3"/>
         </w:numPr>
         <w:ind w:hanging="720"/>
-      </w:pPr>
-      <w:r>
         <w:rPr>
           <w:lang w:val="en-US"/>
         </w:rPr>
-        <w:t xml:space="preserve">HABIBI, F.; CHAKRABORTTY, R. K.; ABBASI, A.; HO, W.: Investigating disruption propagation and resilience of supply chain networks: interplay of tiers and connections. </w:t>
-      </w:r>
-      <w:r>
-        <w:t>International Journal of Production Research, 63(17), S. 6229–6251, 2025. DOI: 10.1080/00207543.2025.2470348 (Abrufdatum: 20.08.2026).</w:t>
+      </w:pPr>
+      <w:r>
+        <w:rPr>
+          <w:lang w:val="en-US"/>
+        </w:rPr>
+        <w:t>FAN, Y.; STEVENSON, M.: A review of supply chain risk management: definition, theory, and research agenda. International Journal of Physical Distribution &amp; Logistics Management, 48(3), S. 205–230, 2018. DOI: 10.1108/IJPDLM-01-2017-0043 (Abrufdatum: 20.08.2026).</w:t>
       </w:r>
     </w:p>
     <w:p>
@@ -12134,10 +12073,10 @@
         <w:rPr>
           <w:lang w:val="en-US"/>
         </w:rPr>
-        <w:t xml:space="preserve">ALMAHRI, S.; XU, L.; BRINTRUP, A.: Enhancing supply chain visibility with knowledge graphs and large language models. </w:t>
-      </w:r>
-      <w:r>
-        <w:t>International Journal of Production Research, 64(6), S. 2178–2209, 2026. DOI: 10.1080/00207543.2025.2575841 (Abrufdatum: 21.08.2026).</w:t>
+        <w:t xml:space="preserve">CHOUDHARY, N. A.; SINGH, S.; SCHOENHERR, T.; RAMKUMAR, M.: Risk assessment in supply chains: a state-of-the-art review of methodologies and their applications. </w:t>
+      </w:r>
+      <w:r>
+        <w:t>Annals of Operations Research, 322(2), S. 565–607, 2023. DOI: 10.1007/s10479-022-04700-9 (Abrufdatum: 21.08.2026).</w:t>
       </w:r>
     </w:p>
     <w:p>
@@ -12148,18 +12087,15 @@
           <w:numId w:val="3"/>
         </w:numPr>
         <w:ind w:hanging="720"/>
+      </w:pPr>
+      <w:r>
         <w:rPr>
           <w:lang w:val="en-US"/>
         </w:rPr>
-      </w:pPr>
-      <w:r>
-        <w:rPr>
-          <w:lang w:val="en-US"/>
-        </w:rPr>
-        <w:t xml:space="preserve">DONG, H.; WANG, Z.: Large Language Models for Tabular Data: Progresses and Future Directions. Proceedings of the 47th International ACM SIGIR Conference on Research and Development in Information Retrieval (SIGIR '24), S. 6388–6391, 2024. </w:t>
-      </w:r>
-      <w:r>
-        <w:t>DOI: 10.1145/3626772.3661384 (Abrufdatum: 21.08.2026).</w:t>
+        <w:t xml:space="preserve">HABIBI, F.; CHAKRABORTTY, R. K.; ABBASI, A.; HO, W.: Investigating disruption propagation and resilience of supply chain networks: interplay of tiers and connections. </w:t>
+      </w:r>
+      <w:r>
+        <w:t>International Journal of Production Research, 63(17), S. 6229–6251, 2025. DOI: 10.1080/00207543.2025.2470348 (Abrufdatum: 20.08.2026).</w:t>
       </w:r>
     </w:p>
     <w:p>
@@ -12172,13 +12108,7 @@
         <w:ind w:hanging="720"/>
       </w:pPr>
       <w:r>
-        <w:rPr>
-          <w:lang w:val="en-US"/>
-        </w:rPr>
-        <w:t xml:space="preserve">HUANG, L.; YU, W.; MA, W.; ZHONG, W.; FENG, Z.; WANG, H.; CHEN, Q.; PENG, W.; FENG, X.; QIN, B.; LIU, T.: A survey on hallucination in large language models: Principles, taxonomy, challenges, and open questions. </w:t>
-      </w:r>
-      <w:r>
-        <w:t>ACM Transactions on Information Systems, 43(2), S. 1–55, 2025. DOI: 10.1145/3703155 (Abrufdatum: 21.08.2026).</w:t>
+        <w:t>VASWANI, A.; SHAZEER, N.; PARMAR, N.; USZKOREIT, J.; JONES, L.; GOMEZ, A. N.; KAISER, Ł.; POLOSUKHIN, I.: Attention is all you need. Advances in Neural Information Processing Systems 30 (NeurIPS 2017), S. 5998–6008, 2017. Online unter: https://proceedings.neurips.cc/paper_files/paper/2017/file/3f5ee243547dee91fbd053c1c4a845aa-Paper.pdf (Abrufdatum: 28.08.2026).</w:t>
       </w:r>
     </w:p>
     <w:p>
@@ -12189,10 +12119,10 @@
           <w:numId w:val="3"/>
         </w:numPr>
         <w:ind w:hanging="720"/>
-        <w:rPr>
-          <w:lang w:val="en-US"/>
-        </w:rPr>
-      </w:pPr>
+      </w:pPr>
+      <w:r>
+        <w:t>BROWN, T. B. et al.: Language models are few-shot learners. Advances in Neural Information Processing Systems 33 (NeurIPS 2020), 2020. Online unter: https://papers.nips.cc/paper/2020/hash/1457c0d6bfcb4967418bfb8ac142f64a-Abstract.html (Abrufdatum: 28.08.2026).</w:t>
+      </w:r>
     </w:p>
     <w:p>
       <w:pPr>
@@ -12202,19 +12132,15 @@
           <w:numId w:val="3"/>
         </w:numPr>
         <w:ind w:hanging="720"/>
+      </w:pPr>
+      <w:r>
         <w:rPr>
           <w:lang w:val="en-US"/>
         </w:rPr>
-      </w:pPr>
-      <w:r>
-        <w:rPr>
-          <w:lang w:val="en-US"/>
-        </w:rPr>
-        <w:lastRenderedPageBreak/>
-        <w:t xml:space="preserve">HOSSAIN, E.; NIPU, M. M. H. B.; MAHMOOD, M. S.; HOSSEN, M. J.; MRIDHA, M. F.: Safe and scalable collaboration in multiagent LLM systems: A comprehensive review. IEEE Transactions on Systems, Man, and Cybernetics: Systems, S. 1–17, 2026. </w:t>
-      </w:r>
-      <w:r>
-        <w:t>DOI: 10.1109/TSMC.2026.3704902 (Abrufdatum: 21.08.2026).</w:t>
+        <w:t xml:space="preserve">ALMAHRI, S.; XU, L.; BRINTRUP, A.: Enhancing supply chain visibility with knowledge graphs and large language models. </w:t>
+      </w:r>
+      <w:r>
+        <w:t>International Journal of Production Research, 64(6), S. 2178–2209, 2026. DOI: 10.1080/00207543.2025.2575841 (Abrufdatum: 21.08.2026).</w:t>
       </w:r>
     </w:p>
     <w:p>
@@ -12225,15 +12151,18 @@
           <w:numId w:val="3"/>
         </w:numPr>
         <w:ind w:hanging="720"/>
-      </w:pPr>
-      <w:r>
         <w:rPr>
           <w:lang w:val="en-US"/>
         </w:rPr>
-        <w:t xml:space="preserve">QUAN, Y.; LIU, Z.; BENABEN, F.; MONTREUIL, B.: Leveraging large language models to enhance multi-agent risk assessment in supply chain networks. </w:t>
-      </w:r>
-      <w:r>
-        <w:t>International Journal of Production Research, 2026. DOI: 10.1080/00207543.2026.2619562 (Abrufdatum: 21.08.2026).</w:t>
+      </w:pPr>
+      <w:r>
+        <w:rPr>
+          <w:lang w:val="en-US"/>
+        </w:rPr>
+        <w:t xml:space="preserve">DONG, H.; WANG, Z.: Large Language Models for Tabular Data: Progresses and Future Directions. Proceedings of the 47th International ACM SIGIR Conference on Research and Development in Information Retrieval (SIGIR '24), S. 6388–6391, 2024. </w:t>
+      </w:r>
+      <w:r>
+        <w:t>DOI: 10.1145/3626772.3661384 (Abrufdatum: 21.08.2026).</w:t>
       </w:r>
     </w:p>
     <w:p>
@@ -12244,15 +12173,18 @@
           <w:numId w:val="3"/>
         </w:numPr>
         <w:ind w:hanging="720"/>
+        <w:rPr>
+          <w:rFonts w:hint="eastAsia"/>
+        </w:rPr>
       </w:pPr>
       <w:r>
         <w:rPr>
           <w:lang w:val="en-US"/>
         </w:rPr>
-        <w:t xml:space="preserve">KOSASIH, E.; MARGAROLI, F.; GELLI, S.; AZIZ, A.; WILDGOOSE, N.; BRINTRUP, A.: Towards knowledge graph reasoning for supply chain risk management using graph neural networks. </w:t>
-      </w:r>
-      <w:r>
-        <w:t>International Journal of Production Research, 62(15), S. 5596–5612, 2024. DOI: 10.1080/00207543.2022.2100841 (Abrufdatum: 21.08.2026).</w:t>
+        <w:t xml:space="preserve">HUANG, L.; YU, W.; MA, W.; ZHONG, W.; FENG, Z.; WANG, H.; CHEN, Q.; PENG, W.; FENG, X.; QIN, B.; LIU, T.: A survey on hallucination in large language models: Principles, taxonomy, challenges, and open questions. </w:t>
+      </w:r>
+      <w:r>
+        <w:t>ACM Transactions on Information Systems, 43(2), S. 1–55, 2025. DOI: 10.1145/3703155 (Abrufdatum: 21.08.2026).</w:t>
       </w:r>
     </w:p>
     <w:p>
@@ -12263,15 +12195,19 @@
           <w:numId w:val="3"/>
         </w:numPr>
         <w:ind w:hanging="720"/>
-      </w:pPr>
-      <w:r>
         <w:rPr>
           <w:lang w:val="en-US"/>
         </w:rPr>
-        <w:t xml:space="preserve">HEVNER, A. R.; MARCH, S. T.; PARK, J.; RAM, S.: Design science in information systems research. </w:t>
-      </w:r>
-      <w:r>
-        <w:t>MIS Quarterly, 28(1), S. 75–105, 2004. DOI: 10.2307/25148625 (Abrufdatum: 21.08.2026).</w:t>
+      </w:pPr>
+      <w:r>
+        <w:rPr>
+          <w:lang w:val="en-US"/>
+        </w:rPr>
+        <w:lastRenderedPageBreak/>
+        <w:t xml:space="preserve">HOSSAIN, E.; NIPU, M. M. H. B.; MAHMOOD, M. S.; HOSSEN, M. J.; MRIDHA, M. F.: Safe and scalable collaboration in multiagent LLM systems: A comprehensive review. IEEE Transactions on Systems, Man, and Cybernetics: Systems, S. 1–17, 2026. </w:t>
+      </w:r>
+      <w:r>
+        <w:t>DOI: 10.1109/TSMC.2026.3704902 (Abrufdatum: 21.08.2026).</w:t>
       </w:r>
     </w:p>
     <w:p>
@@ -12282,15 +12218,15 @@
           <w:numId w:val="3"/>
         </w:numPr>
         <w:ind w:hanging="720"/>
+      </w:pPr>
+      <w:r>
         <w:rPr>
           <w:lang w:val="en-US"/>
         </w:rPr>
-      </w:pPr>
-      <w:r>
-        <w:rPr>
-          <w:lang w:val="en-US"/>
-        </w:rPr>
-        <w:t>MIRZADEH, I.; ALIZADEH, K.; SHAHROKHI, H.; TUZEL, O.; BENGIO, S.; FARAJTABAR, M.: GSM-Symbolic: Understanding the limitations of mathematical reasoning in large language models. International Conference on Learning Representations (ICLR 2025). arXiv:2410.05229, 2025. Online unter: https://arxiv.org/abs/2410.05229 (Abrufdatum: 21.08.2026).</w:t>
+        <w:t xml:space="preserve">QUAN, Y.; LIU, Z.; BENABEN, F.; MONTREUIL, B.: Leveraging large language models to enhance multi-agent risk assessment in supply chain networks. </w:t>
+      </w:r>
+      <w:r>
+        <w:t>International Journal of Production Research, 2026. DOI: 10.1080/00207543.2026.2619562 (Abrufdatum: 21.08.2026).</w:t>
       </w:r>
     </w:p>
     <w:p>
@@ -12306,10 +12242,10 @@
         <w:rPr>
           <w:lang w:val="en-US"/>
         </w:rPr>
-        <w:t xml:space="preserve">JANNELLI, V.; SCHÖPF, S.; BICKEL, M.; NETLAND, T.; BRINTRUP, A.: Agentic LLMs in the supply chain: towards autonomous multi-agent consensus-seeking. </w:t>
-      </w:r>
-      <w:r>
-        <w:t>International Journal of Production Research, 2025. DOI: 10.1080/00207543.2025.2604311 (Abrufdatum: 21.08.2026).</w:t>
+        <w:t xml:space="preserve">KOSASIH, E.; MARGAROLI, F.; GELLI, S.; AZIZ, A.; WILDGOOSE, N.; BRINTRUP, A.: Towards knowledge graph reasoning for supply chain risk management using graph neural networks. </w:t>
+      </w:r>
+      <w:r>
+        <w:t>International Journal of Production Research, 62(15), S. 5596–5612, 2024. DOI: 10.1080/00207543.2022.2100841 (Abrufdatum: 21.08.2026).</w:t>
       </w:r>
     </w:p>
     <w:p>
@@ -12325,10 +12261,10 @@
         <w:rPr>
           <w:lang w:val="en-US"/>
         </w:rPr>
-        <w:t xml:space="preserve">RANGEL, D. A.; OLIVEIRA, T. K.; LEITE, M. S. A.: Supply chain risk classification: discussion and proposal. </w:t>
-      </w:r>
-      <w:r>
-        <w:t>International Journal of Production Research, 53(22), S. 6868–6887, 2014. DOI: 10.1080/00207543.2014.910620 (Abrufdatum: 20.08.2026).</w:t>
+        <w:t xml:space="preserve">HEVNER, A. R.; MARCH, S. T.; PARK, J.; RAM, S.: Design science in information systems research. </w:t>
+      </w:r>
+      <w:r>
+        <w:t>MIS Quarterly, 28(1), S. 75–105, 2004. DOI: 10.2307/25148625 (Abrufdatum: 21.08.2026).</w:t>
       </w:r>
     </w:p>
     <w:p>
@@ -12339,15 +12275,15 @@
           <w:numId w:val="3"/>
         </w:numPr>
         <w:ind w:hanging="720"/>
-      </w:pPr>
-      <w:r>
         <w:rPr>
           <w:lang w:val="en-US"/>
         </w:rPr>
-        <w:t xml:space="preserve">NAATBATT INTERNATIONAL; NATIONAL RENEWABLE ENERGY LABORATORY: North American Lithium-Ion Battery Supply Chain Database, 2025. </w:t>
-      </w:r>
-      <w:r>
-        <w:t>Online unter: https://www.nrel.gov/transportation/li-ion-battery-supply-chain-database (Abrufdatum: 21.08.2026).</w:t>
+      </w:pPr>
+      <w:r>
+        <w:rPr>
+          <w:lang w:val="en-US"/>
+        </w:rPr>
+        <w:t>MIRZADEH, I.; ALIZADEH, K.; SHAHROKHI, H.; TUZEL, O.; BENGIO, S.; FARAJTABAR, M.: GSM-Symbolic: Understanding the limitations of mathematical reasoning in large language models. International Conference on Learning Representations (ICLR 2025). arXiv:2410.05229, 2025. Online unter: https://arxiv.org/abs/2410.05229 (Abrufdatum: 21.08.2026).</w:t>
       </w:r>
     </w:p>
     <w:p>
@@ -12358,15 +12294,15 @@
           <w:numId w:val="3"/>
         </w:numPr>
         <w:ind w:hanging="720"/>
+      </w:pPr>
+      <w:r>
         <w:rPr>
           <w:lang w:val="en-US"/>
         </w:rPr>
-      </w:pPr>
-      <w:r>
-        <w:rPr>
-          <w:lang w:val="en-US"/>
-        </w:rPr>
-        <w:t>WAGNER, S. M.; BODE, C.: An empirical investigation into supply chain vulnerability. Journal of Purchasing and Supply Management, 12(6), S. 301–312, 2006. DOI: 10.1016/j.pursup.2007.01.004 (Abrufdatum: 20.08.2026).</w:t>
+        <w:t xml:space="preserve">JANNELLI, V.; SCHÖPF, S.; BICKEL, M.; NETLAND, T.; BRINTRUP, A.: Agentic LLMs in the supply chain: towards autonomous multi-agent consensus-seeking. </w:t>
+      </w:r>
+      <w:r>
+        <w:t>International Journal of Production Research, 2025. DOI: 10.1080/00207543.2025.2604311 (Abrufdatum: 21.08.2026).</w:t>
       </w:r>
     </w:p>
     <w:p>
@@ -12377,15 +12313,15 @@
           <w:numId w:val="3"/>
         </w:numPr>
         <w:ind w:hanging="720"/>
+      </w:pPr>
+      <w:r>
         <w:rPr>
           <w:lang w:val="en-US"/>
         </w:rPr>
-      </w:pPr>
-      <w:r>
-        <w:rPr>
-          <w:lang w:val="en-US"/>
-        </w:rPr>
-        <w:t>CHANG, W.-S.; LIN, Y.-T.: The effect of lead-time on supply chain resilience performance. Asia Pacific Management Review, 24(4), S. 298–309, 2019. DOI: 10.1016/j.apmrv.2018.10.004 (Abrufdatum: 20.08.2026).</w:t>
+        <w:t xml:space="preserve">RANGEL, D. A.; OLIVEIRA, T. K.; LEITE, M. S. A.: Supply chain risk classification: discussion and proposal. </w:t>
+      </w:r>
+      <w:r>
+        <w:t>International Journal of Production Research, 53(22), S. 6868–6887, 2014. DOI: 10.1080/00207543.2014.910620 (Abrufdatum: 20.08.2026).</w:t>
       </w:r>
     </w:p>
     <w:p>
@@ -12401,6 +12337,63 @@
         <w:rPr>
           <w:lang w:val="en-US"/>
         </w:rPr>
+        <w:t xml:space="preserve">NAATBATT INTERNATIONAL; NATIONAL RENEWABLE ENERGY LABORATORY: North American Lithium-Ion Battery Supply Chain Database, 2025. </w:t>
+      </w:r>
+      <w:r>
+        <w:t>Online unter: https://www.nrel.gov/transportation/li-ion-battery-supply-chain-database (Abrufdatum: 21.08.2026).</w:t>
+      </w:r>
+    </w:p>
+    <w:p>
+      <w:pPr>
+        <w:pStyle w:val="Literaturlisteeinzeilig"/>
+        <w:numPr>
+          <w:ilvl w:val="0"/>
+          <w:numId w:val="3"/>
+        </w:numPr>
+        <w:ind w:hanging="720"/>
+        <w:rPr>
+          <w:lang w:val="en-US"/>
+        </w:rPr>
+      </w:pPr>
+      <w:r>
+        <w:rPr>
+          <w:lang w:val="en-US"/>
+        </w:rPr>
+        <w:t>WAGNER, S. M.; BODE, C.: An empirical investigation into supply chain vulnerability. Journal of Purchasing and Supply Management, 12(6), S. 301–312, 2006. DOI: 10.1016/j.pursup.2007.01.004 (Abrufdatum: 20.08.2026).</w:t>
+      </w:r>
+    </w:p>
+    <w:p>
+      <w:pPr>
+        <w:pStyle w:val="Literaturlisteeinzeilig"/>
+        <w:numPr>
+          <w:ilvl w:val="0"/>
+          <w:numId w:val="3"/>
+        </w:numPr>
+        <w:ind w:hanging="720"/>
+        <w:rPr>
+          <w:lang w:val="en-US"/>
+        </w:rPr>
+      </w:pPr>
+      <w:r>
+        <w:rPr>
+          <w:lang w:val="en-US"/>
+        </w:rPr>
+        <w:t>CHANG, W.-S.; LIN, Y.-T.: The effect of lead-time on supply chain resilience performance. Asia Pacific Management Review, 24(4), S. 298–309, 2019. DOI: 10.1016/j.apmrv.2018.10.004 (Abrufdatum: 20.08.2026).</w:t>
+      </w:r>
+    </w:p>
+    <w:p>
+      <w:pPr>
+        <w:pStyle w:val="Literaturlisteeinzeilig"/>
+        <w:numPr>
+          <w:ilvl w:val="0"/>
+          <w:numId w:val="3"/>
+        </w:numPr>
+        <w:ind w:hanging="720"/>
+      </w:pPr>
+      <w:r>
+        <w:rPr>
+          <w:lang w:val="en-US"/>
+        </w:rPr>
         <w:t xml:space="preserve">MACKAY, J.; MUNOZ, A.; PEPPER, M.: Conceptualising redundancy and flexibility towards supply chain robustness and resilience. </w:t>
       </w:r>
       <w:r>
@@ -12417,7 +12410,6 @@
       <w:pPr>
         <w:pStyle w:val="ad"/>
         <w:rPr>
-          <w:rFonts w:hint="eastAsia"/>
           <w:lang w:val="en-US" w:eastAsia="zh-CN"/>
         </w:rPr>
       </w:pPr>
@@ -12452,70 +12444,59 @@
       <w:pPr>
         <w:jc w:val="center"/>
         <w:rPr>
+          <w:lang w:eastAsia="zh-CN"/>
+        </w:rPr>
+      </w:pPr>
+      <w:r>
+        <w:rPr>
+          <w:lang w:eastAsia="zh-CN"/>
+        </w:rPr>
+        <w:t>Quellcode,</w:t>
+      </w:r>
+      <w:r>
+        <w:t xml:space="preserve"> </w:t>
+      </w:r>
+      <w:r>
+        <w:t>Grafiken, Daten</w:t>
+      </w:r>
+      <w:r>
+        <w:rPr>
+          <w:lang w:eastAsia="zh-CN"/>
+        </w:rPr>
+        <w:t>,</w:t>
+      </w:r>
+      <w:r>
+        <w:rPr>
+          <w:lang w:eastAsia="zh-CN"/>
+        </w:rPr>
+        <w:t xml:space="preserve"> etc.</w:t>
+      </w:r>
+      <w:r>
+        <w:rPr>
           <w:rFonts w:hint="eastAsia"/>
           <w:lang w:eastAsia="zh-CN"/>
         </w:rPr>
-      </w:pPr>
-      <w:r>
-        <w:rPr>
-          <w:lang w:eastAsia="zh-CN"/>
-        </w:rPr>
-        <w:t>Quellcode</w:t>
-      </w:r>
-      <w:r>
-        <w:rPr>
-          <w:lang w:eastAsia="zh-CN"/>
-        </w:rPr>
-        <w:t>,</w:t>
-      </w:r>
-      <w:r>
         <w:t xml:space="preserve"> </w:t>
       </w:r>
       <w:r>
-        <w:t>Grafiken</w:t>
-      </w:r>
-      <w:r>
-        <w:t>, Daten</w:t>
-      </w:r>
-      <w:r>
-        <w:rPr>
-          <w:lang w:eastAsia="zh-CN"/>
-        </w:rPr>
-        <w:t>,</w:t>
-      </w:r>
-      <w:r>
-        <w:rPr>
-          <w:lang w:eastAsia="zh-CN"/>
-        </w:rPr>
-        <w:t xml:space="preserve"> etc.</w:t>
-      </w:r>
-      <w:r>
-        <w:rPr>
-          <w:rFonts w:hint="eastAsia"/>
-          <w:lang w:eastAsia="zh-CN"/>
-        </w:rPr>
+        <w:rPr>
+          <w:lang w:eastAsia="zh-CN"/>
+        </w:rPr>
+        <w:t>(GitHub-Repository:</w:t>
+      </w:r>
+      <w:r>
         <w:t xml:space="preserve"> </w:t>
       </w:r>
       <w:r>
         <w:rPr>
           <w:lang w:eastAsia="zh-CN"/>
         </w:rPr>
-        <w:t>(GitHub-Repository:</w:t>
-      </w:r>
-      <w:r>
-        <w:t xml:space="preserve"> </w:t>
-      </w:r>
-      <w:r>
-        <w:rPr>
-          <w:lang w:eastAsia="zh-CN"/>
-        </w:rPr>
         <w:t>https://github.com/yut29/sc_risk_system)</w:t>
       </w:r>
     </w:p>
     <w:p>
       <w:pPr>
         <w:rPr>
-          <w:rFonts w:hint="eastAsia"/>
           <w:lang w:eastAsia="zh-CN"/>
         </w:rPr>
       </w:pPr>
@@ -12632,7 +12613,6 @@
           <w:tab w:val="left" w:pos="2835"/>
         </w:tabs>
         <w:rPr>
-          <w:rFonts w:hint="eastAsia"/>
           <w:b/>
         </w:rPr>
       </w:pPr>
@@ -12662,11 +12642,6 @@
           <w:lang w:eastAsia="zh-CN"/>
         </w:rPr>
         <w:tab/>
-      </w:r>
-      <w:r>
-        <w:rPr>
-          <w:lang w:eastAsia="zh-CN"/>
-        </w:rPr>
         <w:t>Master-Studium an der Friedrich-Alexander-Universität Erlangen-Nürnberg</w:t>
       </w:r>
       <w:r>
@@ -12742,11 +12717,13 @@
         </w:tabs>
         <w:rPr>
           <w:b/>
+          <w:lang w:val="en-US"/>
         </w:rPr>
       </w:pPr>
       <w:r>
         <w:rPr>
           <w:b/>
+          <w:lang w:val="en-US"/>
         </w:rPr>
         <w:t>Praxiserfahrung:</w:t>
       </w:r>
@@ -12757,7 +12734,6 @@
           <w:tab w:val="left" w:pos="2835"/>
         </w:tabs>
         <w:rPr>
-          <w:rFonts w:hint="eastAsia"/>
           <w:lang w:val="en-US"/>
         </w:rPr>
       </w:pPr>
@@ -12807,39 +12783,38 @@
           <w:tab w:val="left" w:pos="2835"/>
         </w:tabs>
         <w:rPr>
+          <w:lang w:val="en-US"/>
+        </w:rPr>
+      </w:pPr>
+      <w:r>
+        <w:rPr>
           <w:rFonts w:hint="eastAsia"/>
           <w:lang w:val="en-US"/>
         </w:rPr>
-      </w:pPr>
+        <w:t xml:space="preserve">08/2019 </w:t>
+      </w:r>
+      <w:r>
+        <w:rPr>
+          <w:lang w:val="en-US"/>
+        </w:rPr>
+        <w:t>–</w:t>
+      </w:r>
       <w:r>
         <w:rPr>
           <w:rFonts w:hint="eastAsia"/>
           <w:lang w:val="en-US"/>
         </w:rPr>
-        <w:t xml:space="preserve">08/2019 </w:t>
-      </w:r>
-      <w:r>
-        <w:rPr>
-          <w:lang w:val="en-US"/>
-        </w:rPr>
-        <w:t>–</w:t>
+        <w:t xml:space="preserve"> 09/2021:</w:t>
       </w:r>
       <w:r>
         <w:rPr>
           <w:rFonts w:hint="eastAsia"/>
-          <w:lang w:val="en-US"/>
-        </w:rPr>
-        <w:t xml:space="preserve"> 09/2021:</w:t>
-      </w:r>
-      <w:r>
-        <w:rPr>
-          <w:rFonts w:hint="eastAsia"/>
         </w:rPr>
         <w:t xml:space="preserve">　</w:t>
       </w:r>
       <w:r>
         <w:rPr>
-          <w:lang w:eastAsia="zh-CN"/>
+          <w:lang w:val="en-US" w:eastAsia="zh-CN"/>
         </w:rPr>
         <w:tab/>
       </w:r>
@@ -12857,39 +12832,38 @@
           <w:tab w:val="left" w:pos="2835"/>
         </w:tabs>
         <w:rPr>
+          <w:lang w:val="en-US"/>
+        </w:rPr>
+      </w:pPr>
+      <w:r>
+        <w:rPr>
           <w:rFonts w:hint="eastAsia"/>
           <w:lang w:val="en-US"/>
         </w:rPr>
-      </w:pPr>
+        <w:t xml:space="preserve">08/2018 </w:t>
+      </w:r>
+      <w:r>
+        <w:rPr>
+          <w:lang w:val="en-US"/>
+        </w:rPr>
+        <w:t>–</w:t>
+      </w:r>
       <w:r>
         <w:rPr>
           <w:rFonts w:hint="eastAsia"/>
           <w:lang w:val="en-US"/>
         </w:rPr>
-        <w:t xml:space="preserve">08/2018 </w:t>
-      </w:r>
-      <w:r>
-        <w:rPr>
-          <w:lang w:val="en-US"/>
-        </w:rPr>
-        <w:t>–</w:t>
+        <w:t xml:space="preserve"> 08/2019:</w:t>
       </w:r>
       <w:r>
         <w:rPr>
           <w:rFonts w:hint="eastAsia"/>
-          <w:lang w:val="en-US"/>
-        </w:rPr>
-        <w:t xml:space="preserve"> 08/2019:</w:t>
-      </w:r>
-      <w:r>
-        <w:rPr>
-          <w:rFonts w:hint="eastAsia"/>
         </w:rPr>
         <w:t xml:space="preserve">　</w:t>
       </w:r>
       <w:r>
         <w:rPr>
-          <w:lang w:eastAsia="zh-CN"/>
+          <w:lang w:val="en-US" w:eastAsia="zh-CN"/>
         </w:rPr>
         <w:tab/>
       </w:r>
@@ -12938,7 +12912,7 @@
       </w:r>
       <w:r>
         <w:rPr>
-          <w:lang w:eastAsia="zh-CN"/>
+          <w:lang w:val="en-US" w:eastAsia="zh-CN"/>
         </w:rPr>
         <w:tab/>
       </w:r>
@@ -12956,7 +12930,6 @@
           <w:tab w:val="left" w:pos="2835"/>
         </w:tabs>
         <w:rPr>
-          <w:rFonts w:hint="eastAsia"/>
           <w:lang w:val="en-US" w:eastAsia="zh-CN"/>
         </w:rPr>
       </w:pPr>
@@ -12966,6 +12939,9 @@
         <w:tabs>
           <w:tab w:val="left" w:pos="2835"/>
         </w:tabs>
+        <w:rPr>
+          <w:lang w:val="en-US"/>
+        </w:rPr>
       </w:pPr>
     </w:p>
     <w:sectPr>
@@ -13334,7 +13310,7 @@
         <w:rFonts w:cs="Arial"/>
         <w:noProof/>
       </w:rPr>
-      <w:t>Inhaltsverzeichnis</w:t>
+      <w:t>Abbildungsverzeichnis</w:t>
     </w:r>
     <w:r>
       <w:rPr>
@@ -13446,7 +13422,7 @@
         <w:rFonts w:cs="Arial"/>
         <w:noProof/>
       </w:rPr>
-      <w:t>Einleitung und Zielstellung</w:t>
+      <w:t>Grundlagen und Stand der Technik</w:t>
     </w:r>
     <w:r>
       <w:rPr>

</xml_diff>